<commit_message>
Domain model: stores figure, lake decision tree, Andrew Preston credit
- Cover credit is now 'designed by Andrew Preston · built by the CryptAlyst
  engineering team'; the colophon carries the same line.
- New Level 3 section, The data stores: the eight places data is actually written
  on this machine — the 60 GB journal, derived datasets, live state, ledgers,
  archives, older journals, the in-memory index and the logs — with format, writer
  and lifetime for each.
- New Level 3 section, How the lake chooses: the decision tree that decides which
  store receives an envelope, how long it lives, and when a segment is sealed and
  compressed. Every branch is a rule; nothing is deleted by a rule not drawn.
- Figure index now lists all ten figures. 19 pages, still landscape, still no page
  number on the cover.
</commit_message>
<xml_diff>
--- a/docs/domain/CryptAlyst-Domain-Model.docx
+++ b/docs/domain/CryptAlyst-Domain-Model.docx
@@ -300,16 +300,10 @@
               <w:t>The order of the gate — identity and freshness before arithmetic — and the exit policy that books losses.</w:t>
             </w:r>
           </w:p>
-        </w:tc>
-        <w:tc>
-          <w:tcPr>
-            <w:tcW w:type="dxa" w:w="7200"/>
-          </w:tcPr>
           <w:p>
             <w:pPr>
               <w:spacing w:after="100"/>
             </w:pPr>
-            <w:r/>
             <w:r>
               <w:rPr>
                 <w:color w:val="8A94A0"/>
@@ -339,10 +333,16 @@
               <w:t>The only writer of the record, and the derived references it attaches when a producer did not declare its inputs.</w:t>
             </w:r>
           </w:p>
+        </w:tc>
+        <w:tc>
+          <w:tcPr>
+            <w:tcW w:type="dxa" w:w="7200"/>
+          </w:tcPr>
           <w:p>
             <w:pPr>
               <w:spacing w:after="100"/>
             </w:pPr>
+            <w:r/>
             <w:r>
               <w:rPr>
                 <w:color w:val="8A94A0"/>
@@ -422,6 +422,72 @@
                 <w:color w:val="18202A"/>
                 <w:sz w:val="19"/>
               </w:rPr>
+              <w:t>Level 3 — the data stores, as they exist</w:t>
+            </w:r>
+          </w:p>
+          <w:p>
+            <w:pPr>
+              <w:spacing w:after="100"/>
+              <w:ind w:left="403"/>
+            </w:pPr>
+            <w:r>
+              <w:rPr>
+                <w:color w:val="5C6672"/>
+                <w:sz w:val="16"/>
+              </w:rPr>
+              <w:t>Every place data is actually written on this machine, in which format, by which process, for how long.</w:t>
+            </w:r>
+          </w:p>
+          <w:p>
+            <w:pPr>
+              <w:spacing w:after="100"/>
+            </w:pPr>
+            <w:r>
+              <w:rPr>
+                <w:color w:val="8A94A0"/>
+                <w:sz w:val="17"/>
+              </w:rPr>
+              <w:t xml:space="preserve">11   </w:t>
+            </w:r>
+            <w:r>
+              <w:rPr>
+                <w:b/>
+                <w:color w:val="18202A"/>
+                <w:sz w:val="19"/>
+              </w:rPr>
+              <w:t>Level 3 — how the lake chooses</w:t>
+            </w:r>
+          </w:p>
+          <w:p>
+            <w:pPr>
+              <w:spacing w:after="100"/>
+              <w:ind w:left="403"/>
+            </w:pPr>
+            <w:r>
+              <w:rPr>
+                <w:color w:val="5C6672"/>
+                <w:sz w:val="16"/>
+              </w:rPr>
+              <w:t>The decision tree that decides which store receives an envelope, how long it lives, and when a segment is sealed.</w:t>
+            </w:r>
+          </w:p>
+          <w:p>
+            <w:pPr>
+              <w:spacing w:after="100"/>
+            </w:pPr>
+            <w:r>
+              <w:rPr>
+                <w:color w:val="8A94A0"/>
+                <w:sz w:val="17"/>
+              </w:rPr>
+              <w:t xml:space="preserve">12   </w:t>
+            </w:r>
+            <w:r>
+              <w:rPr>
+                <w:b/>
+                <w:color w:val="18202A"/>
+                <w:sz w:val="19"/>
+              </w:rPr>
               <w:t>Level 2 — control, what may change behaviour</w:t>
             </w:r>
           </w:p>
@@ -447,7 +513,7 @@
                 <w:color w:val="8A94A0"/>
                 <w:sz w:val="17"/>
               </w:rPr>
-              <w:t xml:space="preserve">11   </w:t>
+              <w:t xml:space="preserve">13   </w:t>
             </w:r>
             <w:r>
               <w:rPr>
@@ -480,7 +546,7 @@
                 <w:color w:val="8A94A0"/>
                 <w:sz w:val="17"/>
               </w:rPr>
-              <w:t xml:space="preserve">12   </w:t>
+              <w:t xml:space="preserve">14   </w:t>
             </w:r>
             <w:r>
               <w:rPr>
@@ -933,6 +999,94 @@
                 <w:sz w:val="15"/>
               </w:rPr>
               <w:t>supervise, stop, and what STOP must never touch</w:t>
+            </w:r>
+          </w:p>
+        </w:tc>
+      </w:tr>
+      <w:tr>
+        <w:tc>
+          <w:tcPr>
+            <w:tcW w:type="dxa" w:w="4797"/>
+          </w:tcPr>
+          <w:p>
+            <w:r/>
+            <w:r>
+              <w:rPr>
+                <w:sz w:val="15"/>
+              </w:rPr>
+              <w:t>9</w:t>
+            </w:r>
+          </w:p>
+        </w:tc>
+        <w:tc>
+          <w:tcPr>
+            <w:tcW w:type="dxa" w:w="4797"/>
+          </w:tcPr>
+          <w:p>
+            <w:r/>
+            <w:r>
+              <w:rPr>
+                <w:sz w:val="15"/>
+              </w:rPr>
+              <w:t>Data stores</w:t>
+            </w:r>
+          </w:p>
+        </w:tc>
+        <w:tc>
+          <w:tcPr>
+            <w:tcW w:type="dxa" w:w="4797"/>
+          </w:tcPr>
+          <w:p>
+            <w:r/>
+            <w:r>
+              <w:rPr>
+                <w:sz w:val="15"/>
+              </w:rPr>
+              <w:t>every store on disk: format, writer, reader, lifetime</w:t>
+            </w:r>
+          </w:p>
+        </w:tc>
+      </w:tr>
+      <w:tr>
+        <w:tc>
+          <w:tcPr>
+            <w:tcW w:type="dxa" w:w="4797"/>
+          </w:tcPr>
+          <w:p>
+            <w:r/>
+            <w:r>
+              <w:rPr>
+                <w:sz w:val="15"/>
+              </w:rPr>
+              <w:t>10</w:t>
+            </w:r>
+          </w:p>
+        </w:tc>
+        <w:tc>
+          <w:tcPr>
+            <w:tcW w:type="dxa" w:w="4797"/>
+          </w:tcPr>
+          <w:p>
+            <w:r/>
+            <w:r>
+              <w:rPr>
+                <w:sz w:val="15"/>
+              </w:rPr>
+              <w:t>How the lake chooses</w:t>
+            </w:r>
+          </w:p>
+        </w:tc>
+        <w:tc>
+          <w:tcPr>
+            <w:tcW w:type="dxa" w:w="4797"/>
+          </w:tcPr>
+          <w:p>
+            <w:r/>
+            <w:r>
+              <w:rPr>
+                <w:sz w:val="15"/>
+              </w:rPr>
+              <w:t>the rules that decide where data lands and how long it lives</w:t>
             </w:r>
           </w:p>
         </w:tc>
@@ -3800,6 +3954,895 @@
           <w:color w:val="1B4A6F"/>
           <w:sz w:val="38"/>
         </w:rPr>
+        <w:t>Level 3 — the data stores, as they exist</w:t>
+      </w:r>
+    </w:p>
+    <w:p>
+      <w:pPr>
+        <w:spacing w:before="0" w:after="160"/>
+        <w:shd w:val="clear" w:fill="EEF3F8"/>
+        <w:pBdr>
+          <w:left w:val="single" w:sz="24" w:space="8" w:color="2E6DB4"/>
+        </w:pBdr>
+      </w:pPr>
+      <w:r>
+        <w:rPr>
+          <w:b/>
+          <w:color w:val="2E6DB4"/>
+          <w:sz w:val="15"/>
+        </w:rPr>
+        <w:t xml:space="preserve">WHAT THIS SHOWS   </w:t>
+      </w:r>
+      <w:r>
+        <w:rPr>
+          <w:color w:val="18202A"/>
+          <w:sz w:val="19"/>
+        </w:rPr>
+        <w:t>Every place data is actually written on this machine, in which format, by which process, for how long.</w:t>
+      </w:r>
+    </w:p>
+    <w:p>
+      <w:pPr>
+        <w:spacing w:after="40"/>
+        <w:jc w:val="center"/>
+      </w:pPr>
+      <w:r>
+        <w:drawing>
+          <wp:inline xmlns:a="http://schemas.openxmlformats.org/drawingml/2006/main" xmlns:pic="http://schemas.openxmlformats.org/drawingml/2006/picture">
+            <wp:extent cx="6830568" cy="2880360"/>
+            <wp:docPr id="9" name="Picture 9"/>
+            <wp:cNvGraphicFramePr>
+              <a:graphicFrameLocks noChangeAspect="1"/>
+            </wp:cNvGraphicFramePr>
+            <a:graphic>
+              <a:graphicData uri="http://schemas.openxmlformats.org/drawingml/2006/picture">
+                <pic:pic>
+                  <pic:nvPicPr>
+                    <pic:cNvPr id="0" name="09-stores.png"/>
+                    <pic:cNvPicPr/>
+                  </pic:nvPicPr>
+                  <pic:blipFill>
+                    <a:blip r:embed="rId18"/>
+                    <a:stretch>
+                      <a:fillRect/>
+                    </a:stretch>
+                  </pic:blipFill>
+                  <pic:spPr>
+                    <a:xfrm>
+                      <a:off x="0" y="0"/>
+                      <a:ext cx="6830568" cy="2880360"/>
+                    </a:xfrm>
+                    <a:prstGeom prst="rect"/>
+                  </pic:spPr>
+                </pic:pic>
+              </a:graphicData>
+            </a:graphic>
+          </wp:inline>
+        </w:drawing>
+      </w:r>
+    </w:p>
+    <w:p>
+      <w:pPr>
+        <w:spacing w:after="120"/>
+        <w:jc w:val="center"/>
+      </w:pPr>
+      <w:r>
+        <w:rPr>
+          <w:i/>
+          <w:color w:val="8A94A0"/>
+          <w:sz w:val="16"/>
+        </w:rPr>
+        <w:t>Figure 9 — Eight stores. The journal is the only one that is a record; the rest are derived, cached, archived or diagnostic.</w:t>
+      </w:r>
+    </w:p>
+    <w:p>
+      <w:pPr>
+        <w:spacing w:after="120"/>
+      </w:pPr>
+      <w:r>
+        <w:rPr>
+          <w:i w:val="0"/>
+          <w:sz w:val="20"/>
+        </w:rPr>
+        <w:t>It is worth being literal about storage, because most architectures hide their stores behind services. Here there are eight, and every one of them is a file you can open.</w:t>
+      </w:r>
+    </w:p>
+    <w:p>
+      <w:pPr>
+        <w:spacing w:after="120"/>
+      </w:pPr>
+      <w:r>
+        <w:rPr>
+          <w:i w:val="0"/>
+          <w:sz w:val="20"/>
+        </w:rPr>
+        <w:t>The journal is the record: 60 GB of JSONL, one envelope per line, written by the recorder alone. The datasets are derived from it by the historian. Live state is what the books currently hold, rewritten in place and explicitly not a record. Ledgers are the per-engine trade files, appended by the engines themselves. Archives are copies taken before a reset. The index is memory, rebuilt at boot. Logs are diagnostic. Older journals are kept for replay comparison.</w:t>
+      </w:r>
+    </w:p>
+    <w:tbl>
+      <w:tblPr>
+        <w:tblStyle w:val="TableGrid"/>
+        <w:tblW w:type="auto" w:w="0"/>
+        <w:jc w:val="center"/>
+        <w:tblLook w:firstColumn="1" w:firstRow="1" w:lastColumn="0" w:lastRow="0" w:noHBand="0" w:noVBand="1" w:val="04A0"/>
+      </w:tblPr>
+      <w:tblGrid>
+        <w:gridCol w:w="3597"/>
+        <w:gridCol w:w="3597"/>
+        <w:gridCol w:w="3597"/>
+        <w:gridCol w:w="3597"/>
+      </w:tblGrid>
+      <w:tr>
+        <w:tc>
+          <w:tcPr>
+            <w:tcW w:type="dxa" w:w="3597"/>
+            <w:shd w:fill="F1F4F7"/>
+          </w:tcPr>
+          <w:p>
+            <w:r/>
+            <w:r>
+              <w:rPr>
+                <w:b/>
+                <w:color w:val="5C6672"/>
+                <w:sz w:val="14"/>
+              </w:rPr>
+              <w:t>STORE</w:t>
+            </w:r>
+          </w:p>
+        </w:tc>
+        <w:tc>
+          <w:tcPr>
+            <w:tcW w:type="dxa" w:w="3597"/>
+            <w:shd w:fill="F1F4F7"/>
+          </w:tcPr>
+          <w:p>
+            <w:r/>
+            <w:r>
+              <w:rPr>
+                <w:b/>
+                <w:color w:val="5C6672"/>
+                <w:sz w:val="14"/>
+              </w:rPr>
+              <w:t>FORMAT</w:t>
+            </w:r>
+          </w:p>
+        </w:tc>
+        <w:tc>
+          <w:tcPr>
+            <w:tcW w:type="dxa" w:w="3597"/>
+            <w:shd w:fill="F1F4F7"/>
+          </w:tcPr>
+          <w:p>
+            <w:r/>
+            <w:r>
+              <w:rPr>
+                <w:b/>
+                <w:color w:val="5C6672"/>
+                <w:sz w:val="14"/>
+              </w:rPr>
+              <w:t>WRITTEN BY</w:t>
+            </w:r>
+          </w:p>
+        </w:tc>
+        <w:tc>
+          <w:tcPr>
+            <w:tcW w:type="dxa" w:w="3597"/>
+            <w:shd w:fill="F1F4F7"/>
+          </w:tcPr>
+          <w:p>
+            <w:r/>
+            <w:r>
+              <w:rPr>
+                <w:b/>
+                <w:color w:val="5C6672"/>
+                <w:sz w:val="14"/>
+              </w:rPr>
+              <w:t>LIFETIME</w:t>
+            </w:r>
+          </w:p>
+        </w:tc>
+      </w:tr>
+      <w:tr>
+        <w:tc>
+          <w:tcPr>
+            <w:tcW w:type="dxa" w:w="3597"/>
+          </w:tcPr>
+          <w:p>
+            <w:r/>
+            <w:r>
+              <w:rPr>
+                <w:sz w:val="17"/>
+              </w:rPr>
+              <w:t>state/lake3/envelopes.jsonl</w:t>
+            </w:r>
+          </w:p>
+        </w:tc>
+        <w:tc>
+          <w:tcPr>
+            <w:tcW w:type="dxa" w:w="3597"/>
+          </w:tcPr>
+          <w:p>
+            <w:r/>
+            <w:r>
+              <w:rPr>
+                <w:sz w:val="17"/>
+              </w:rPr>
+              <w:t>JSONL</w:t>
+            </w:r>
+          </w:p>
+        </w:tc>
+        <w:tc>
+          <w:tcPr>
+            <w:tcW w:type="dxa" w:w="3597"/>
+          </w:tcPr>
+          <w:p>
+            <w:r/>
+            <w:r>
+              <w:rPr>
+                <w:sz w:val="17"/>
+              </w:rPr>
+              <w:t>recorder</w:t>
+            </w:r>
+          </w:p>
+        </w:tc>
+        <w:tc>
+          <w:tcPr>
+            <w:tcW w:type="dxa" w:w="3597"/>
+          </w:tcPr>
+          <w:p>
+            <w:r/>
+            <w:r>
+              <w:rPr>
+                <w:sz w:val="17"/>
+              </w:rPr>
+              <w:t>the record; rotated and expired by policy</w:t>
+            </w:r>
+          </w:p>
+        </w:tc>
+      </w:tr>
+      <w:tr>
+        <w:tc>
+          <w:tcPr>
+            <w:tcW w:type="dxa" w:w="3597"/>
+          </w:tcPr>
+          <w:p>
+            <w:r/>
+            <w:r>
+              <w:rPr>
+                <w:sz w:val="17"/>
+              </w:rPr>
+              <w:t>datasets/</w:t>
+            </w:r>
+          </w:p>
+        </w:tc>
+        <w:tc>
+          <w:tcPr>
+            <w:tcW w:type="dxa" w:w="3597"/>
+          </w:tcPr>
+          <w:p>
+            <w:r/>
+            <w:r>
+              <w:rPr>
+                <w:sz w:val="17"/>
+              </w:rPr>
+              <w:t>CSV + JSON</w:t>
+            </w:r>
+          </w:p>
+        </w:tc>
+        <w:tc>
+          <w:tcPr>
+            <w:tcW w:type="dxa" w:w="3597"/>
+          </w:tcPr>
+          <w:p>
+            <w:r/>
+            <w:r>
+              <w:rPr>
+                <w:sz w:val="17"/>
+              </w:rPr>
+              <w:t>historian</w:t>
+            </w:r>
+          </w:p>
+        </w:tc>
+        <w:tc>
+          <w:tcPr>
+            <w:tcW w:type="dxa" w:w="3597"/>
+          </w:tcPr>
+          <w:p>
+            <w:r/>
+            <w:r>
+              <w:rPr>
+                <w:sz w:val="17"/>
+              </w:rPr>
+              <w:t>rebuilt on demand</w:t>
+            </w:r>
+          </w:p>
+        </w:tc>
+      </w:tr>
+      <w:tr>
+        <w:tc>
+          <w:tcPr>
+            <w:tcW w:type="dxa" w:w="3597"/>
+          </w:tcPr>
+          <w:p>
+            <w:r/>
+            <w:r>
+              <w:rPr>
+                <w:sz w:val="17"/>
+              </w:rPr>
+              <w:t>state/pack_*.json</w:t>
+            </w:r>
+          </w:p>
+        </w:tc>
+        <w:tc>
+          <w:tcPr>
+            <w:tcW w:type="dxa" w:w="3597"/>
+          </w:tcPr>
+          <w:p>
+            <w:r/>
+            <w:r>
+              <w:rPr>
+                <w:sz w:val="17"/>
+              </w:rPr>
+              <w:t>JSON</w:t>
+            </w:r>
+          </w:p>
+        </w:tc>
+        <w:tc>
+          <w:tcPr>
+            <w:tcW w:type="dxa" w:w="3597"/>
+          </w:tcPr>
+          <w:p>
+            <w:r/>
+            <w:r>
+              <w:rPr>
+                <w:sz w:val="17"/>
+              </w:rPr>
+              <w:t>each book</w:t>
+            </w:r>
+          </w:p>
+        </w:tc>
+        <w:tc>
+          <w:tcPr>
+            <w:tcW w:type="dxa" w:w="3597"/>
+          </w:tcPr>
+          <w:p>
+            <w:r/>
+            <w:r>
+              <w:rPr>
+                <w:sz w:val="17"/>
+              </w:rPr>
+              <w:t>until the next write</w:t>
+            </w:r>
+          </w:p>
+        </w:tc>
+      </w:tr>
+      <w:tr>
+        <w:tc>
+          <w:tcPr>
+            <w:tcW w:type="dxa" w:w="3597"/>
+          </w:tcPr>
+          <w:p>
+            <w:r/>
+            <w:r>
+              <w:rPr>
+                <w:sz w:val="17"/>
+              </w:rPr>
+              <w:t>ledger/*.jsonl</w:t>
+            </w:r>
+          </w:p>
+        </w:tc>
+        <w:tc>
+          <w:tcPr>
+            <w:tcW w:type="dxa" w:w="3597"/>
+          </w:tcPr>
+          <w:p>
+            <w:r/>
+            <w:r>
+              <w:rPr>
+                <w:sz w:val="17"/>
+              </w:rPr>
+              <w:t>JSONL</w:t>
+            </w:r>
+          </w:p>
+        </w:tc>
+        <w:tc>
+          <w:tcPr>
+            <w:tcW w:type="dxa" w:w="3597"/>
+          </w:tcPr>
+          <w:p>
+            <w:r/>
+            <w:r>
+              <w:rPr>
+                <w:sz w:val="17"/>
+              </w:rPr>
+              <w:t>each engine</w:t>
+            </w:r>
+          </w:p>
+        </w:tc>
+        <w:tc>
+          <w:tcPr>
+            <w:tcW w:type="dxa" w:w="3597"/>
+          </w:tcPr>
+          <w:p>
+            <w:r/>
+            <w:r>
+              <w:rPr>
+                <w:sz w:val="17"/>
+              </w:rPr>
+              <w:t>append only, never expired</w:t>
+            </w:r>
+          </w:p>
+        </w:tc>
+      </w:tr>
+      <w:tr>
+        <w:tc>
+          <w:tcPr>
+            <w:tcW w:type="dxa" w:w="3597"/>
+          </w:tcPr>
+          <w:p>
+            <w:r/>
+            <w:r>
+              <w:rPr>
+                <w:sz w:val="17"/>
+              </w:rPr>
+              <w:t>state/archive_*</w:t>
+            </w:r>
+          </w:p>
+        </w:tc>
+        <w:tc>
+          <w:tcPr>
+            <w:tcW w:type="dxa" w:w="3597"/>
+          </w:tcPr>
+          <w:p>
+            <w:r/>
+            <w:r>
+              <w:rPr>
+                <w:sz w:val="17"/>
+              </w:rPr>
+              <w:t>JSON</w:t>
+            </w:r>
+          </w:p>
+        </w:tc>
+        <w:tc>
+          <w:tcPr>
+            <w:tcW w:type="dxa" w:w="3597"/>
+          </w:tcPr>
+          <w:p>
+            <w:r/>
+            <w:r>
+              <w:rPr>
+                <w:sz w:val="17"/>
+              </w:rPr>
+              <w:t>control on reset</w:t>
+            </w:r>
+          </w:p>
+        </w:tc>
+        <w:tc>
+          <w:tcPr>
+            <w:tcW w:type="dxa" w:w="3597"/>
+          </w:tcPr>
+          <w:p>
+            <w:r/>
+            <w:r>
+              <w:rPr>
+                <w:sz w:val="17"/>
+              </w:rPr>
+              <w:t>kept for recovery</w:t>
+            </w:r>
+          </w:p>
+        </w:tc>
+      </w:tr>
+      <w:tr>
+        <w:tc>
+          <w:tcPr>
+            <w:tcW w:type="dxa" w:w="3597"/>
+          </w:tcPr>
+          <w:p>
+            <w:r/>
+            <w:r>
+              <w:rPr>
+                <w:sz w:val="17"/>
+              </w:rPr>
+              <w:t>state/lake, lake2, lake4</w:t>
+            </w:r>
+          </w:p>
+        </w:tc>
+        <w:tc>
+          <w:tcPr>
+            <w:tcW w:type="dxa" w:w="3597"/>
+          </w:tcPr>
+          <w:p>
+            <w:r/>
+            <w:r>
+              <w:rPr>
+                <w:sz w:val="17"/>
+              </w:rPr>
+              <w:t>JSONL</w:t>
+            </w:r>
+          </w:p>
+        </w:tc>
+        <w:tc>
+          <w:tcPr>
+            <w:tcW w:type="dxa" w:w="3597"/>
+          </w:tcPr>
+          <w:p>
+            <w:r/>
+            <w:r>
+              <w:rPr>
+                <w:sz w:val="17"/>
+              </w:rPr>
+              <w:t>older recorders</w:t>
+            </w:r>
+          </w:p>
+        </w:tc>
+        <w:tc>
+          <w:tcPr>
+            <w:tcW w:type="dxa" w:w="3597"/>
+          </w:tcPr>
+          <w:p>
+            <w:r/>
+            <w:r>
+              <w:rPr>
+                <w:sz w:val="17"/>
+              </w:rPr>
+              <w:t>cold, for comparison</w:t>
+            </w:r>
+          </w:p>
+        </w:tc>
+      </w:tr>
+      <w:tr>
+        <w:tc>
+          <w:tcPr>
+            <w:tcW w:type="dxa" w:w="3597"/>
+          </w:tcPr>
+          <w:p>
+            <w:r/>
+            <w:r>
+              <w:rPr>
+                <w:sz w:val="17"/>
+              </w:rPr>
+              <w:t>index (memory)</w:t>
+            </w:r>
+          </w:p>
+        </w:tc>
+        <w:tc>
+          <w:tcPr>
+            <w:tcW w:type="dxa" w:w="3597"/>
+          </w:tcPr>
+          <w:p>
+            <w:r/>
+            <w:r>
+              <w:rPr>
+                <w:sz w:val="17"/>
+              </w:rPr>
+              <w:t>offsets</w:t>
+            </w:r>
+          </w:p>
+        </w:tc>
+        <w:tc>
+          <w:tcPr>
+            <w:tcW w:type="dxa" w:w="3597"/>
+          </w:tcPr>
+          <w:p>
+            <w:r/>
+            <w:r>
+              <w:rPr>
+                <w:sz w:val="17"/>
+              </w:rPr>
+              <w:t>the explorer</w:t>
+            </w:r>
+          </w:p>
+        </w:tc>
+        <w:tc>
+          <w:tcPr>
+            <w:tcW w:type="dxa" w:w="3597"/>
+          </w:tcPr>
+          <w:p>
+            <w:r/>
+            <w:r>
+              <w:rPr>
+                <w:sz w:val="17"/>
+              </w:rPr>
+              <w:t>rebuilt on boot</w:t>
+            </w:r>
+          </w:p>
+        </w:tc>
+      </w:tr>
+      <w:tr>
+        <w:tc>
+          <w:tcPr>
+            <w:tcW w:type="dxa" w:w="3597"/>
+          </w:tcPr>
+          <w:p>
+            <w:r/>
+            <w:r>
+              <w:rPr>
+                <w:sz w:val="17"/>
+              </w:rPr>
+              <w:t>logs/</w:t>
+            </w:r>
+          </w:p>
+        </w:tc>
+        <w:tc>
+          <w:tcPr>
+            <w:tcW w:type="dxa" w:w="3597"/>
+          </w:tcPr>
+          <w:p>
+            <w:r/>
+            <w:r>
+              <w:rPr>
+                <w:sz w:val="17"/>
+              </w:rPr>
+              <w:t>text</w:t>
+            </w:r>
+          </w:p>
+        </w:tc>
+        <w:tc>
+          <w:tcPr>
+            <w:tcW w:type="dxa" w:w="3597"/>
+          </w:tcPr>
+          <w:p>
+            <w:r/>
+            <w:r>
+              <w:rPr>
+                <w:sz w:val="17"/>
+              </w:rPr>
+              <w:t>every process</w:t>
+            </w:r>
+          </w:p>
+        </w:tc>
+        <w:tc>
+          <w:tcPr>
+            <w:tcW w:type="dxa" w:w="3597"/>
+          </w:tcPr>
+          <w:p>
+            <w:r/>
+            <w:r>
+              <w:rPr>
+                <w:sz w:val="17"/>
+              </w:rPr>
+              <w:t>diagnostic</w:t>
+            </w:r>
+          </w:p>
+        </w:tc>
+      </w:tr>
+    </w:tbl>
+    <w:p>
+      <w:pPr>
+        <w:pageBreakBefore/>
+        <w:spacing w:before="40" w:after="120"/>
+      </w:pPr>
+      <w:r>
+        <w:rPr>
+          <w:b/>
+          <w:color w:val="8A94A0"/>
+          <w:sz w:val="22"/>
+        </w:rPr>
+        <w:t xml:space="preserve">11   </w:t>
+      </w:r>
+      <w:r>
+        <w:rPr>
+          <w:b/>
+          <w:color w:val="1B4A6F"/>
+          <w:sz w:val="38"/>
+        </w:rPr>
+        <w:t>Level 3 — how the lake chooses</w:t>
+      </w:r>
+    </w:p>
+    <w:p>
+      <w:pPr>
+        <w:spacing w:before="0" w:after="160"/>
+        <w:shd w:val="clear" w:fill="EEF3F8"/>
+        <w:pBdr>
+          <w:left w:val="single" w:sz="24" w:space="8" w:color="2E6DB4"/>
+        </w:pBdr>
+      </w:pPr>
+      <w:r>
+        <w:rPr>
+          <w:b/>
+          <w:color w:val="2E6DB4"/>
+          <w:sz w:val="15"/>
+        </w:rPr>
+        <w:t xml:space="preserve">WHAT THIS SHOWS   </w:t>
+      </w:r>
+      <w:r>
+        <w:rPr>
+          <w:color w:val="18202A"/>
+          <w:sz w:val="19"/>
+        </w:rPr>
+        <w:t>The decision tree that decides which store receives an envelope, how long it lives, and when a segment is sealed.</w:t>
+      </w:r>
+    </w:p>
+    <w:p>
+      <w:pPr>
+        <w:spacing w:after="40"/>
+        <w:jc w:val="center"/>
+      </w:pPr>
+      <w:r>
+        <w:drawing>
+          <wp:inline xmlns:a="http://schemas.openxmlformats.org/drawingml/2006/main" xmlns:pic="http://schemas.openxmlformats.org/drawingml/2006/picture">
+            <wp:extent cx="7200313" cy="3383280"/>
+            <wp:docPr id="10" name="Picture 10"/>
+            <wp:cNvGraphicFramePr>
+              <a:graphicFrameLocks noChangeAspect="1"/>
+            </wp:cNvGraphicFramePr>
+            <a:graphic>
+              <a:graphicData uri="http://schemas.openxmlformats.org/drawingml/2006/picture">
+                <pic:pic>
+                  <pic:nvPicPr>
+                    <pic:cNvPr id="0" name="10-decision-tree.png"/>
+                    <pic:cNvPicPr/>
+                  </pic:nvPicPr>
+                  <pic:blipFill>
+                    <a:blip r:embed="rId19"/>
+                    <a:stretch>
+                      <a:fillRect/>
+                    </a:stretch>
+                  </pic:blipFill>
+                  <pic:spPr>
+                    <a:xfrm>
+                      <a:off x="0" y="0"/>
+                      <a:ext cx="7200313" cy="3383280"/>
+                    </a:xfrm>
+                    <a:prstGeom prst="rect"/>
+                  </pic:spPr>
+                </pic:pic>
+              </a:graphicData>
+            </a:graphic>
+          </wp:inline>
+        </w:drawing>
+      </w:r>
+    </w:p>
+    <w:p>
+      <w:pPr>
+        <w:spacing w:after="120"/>
+        <w:jc w:val="center"/>
+      </w:pPr>
+      <w:r>
+        <w:rPr>
+          <w:i/>
+          <w:color w:val="8A94A0"/>
+          <w:sz w:val="16"/>
+        </w:rPr>
+        <w:t>Figure 10 — One question per level: what is it, how long does it live, is it big enough to seal. Nothing is deleted by a rule that is not drawn here.</w:t>
+      </w:r>
+    </w:p>
+    <w:tbl>
+      <w:tblPr>
+        <w:tblW w:type="auto" w:w="0"/>
+        <w:tblLayout w:type="fixed"/>
+        <w:tblLook w:firstColumn="1" w:firstRow="1" w:lastColumn="0" w:lastRow="0" w:noHBand="0" w:noVBand="1" w:val="04A0"/>
+      </w:tblPr>
+      <w:tblGrid>
+        <w:gridCol w:w="7195"/>
+        <w:gridCol w:w="7195"/>
+      </w:tblGrid>
+      <w:tr>
+        <w:tc>
+          <w:tcPr>
+            <w:tcW w:type="dxa" w:w="8784"/>
+          </w:tcPr>
+          <w:p>
+            <w:r/>
+            <w:r>
+              <w:rPr>
+                <w:sz w:val="19"/>
+              </w:rPr>
+              <w:t>Retention is not a setting in a configuration file; it is a short tree. An envelope arrives, and the first question is whether it is a trading outcome. Outcomes go to the silver record — the ledger and the fills file — which is never rotated and never expired, because a trade record that disappears is not a record.</w:t>
+            </w:r>
+          </w:p>
+        </w:tc>
+        <w:tc>
+          <w:tcPr>
+            <w:tcW w:type="dxa" w:w="5472"/>
+          </w:tcPr>
+          <w:p>
+            <w:pPr>
+              <w:spacing w:after="40"/>
+            </w:pPr>
+            <w:r/>
+            <w:r>
+              <w:rPr>
+                <w:color w:val="2E6DB4"/>
+                <w:sz w:val="18"/>
+              </w:rPr>
+              <w:t xml:space="preserve">· </w:t>
+            </w:r>
+            <w:r>
+              <w:rPr>
+                <w:sz w:val="18"/>
+              </w:rPr>
+              <w:t>a trading outcome is never expired; it is the part of the record that must survive</w:t>
+            </w:r>
+          </w:p>
+          <w:p>
+            <w:pPr>
+              <w:spacing w:after="40"/>
+            </w:pPr>
+            <w:r>
+              <w:rPr>
+                <w:color w:val="2E6DB4"/>
+                <w:sz w:val="18"/>
+              </w:rPr>
+              <w:t xml:space="preserve">· </w:t>
+            </w:r>
+            <w:r>
+              <w:rPr>
+                <w:sz w:val="18"/>
+              </w:rPr>
+              <w:t>the journal is the default, and its lifetime is decided by topic class, not by age alone</w:t>
+            </w:r>
+          </w:p>
+          <w:p>
+            <w:pPr>
+              <w:spacing w:after="40"/>
+            </w:pPr>
+            <w:r>
+              <w:rPr>
+                <w:color w:val="2E6DB4"/>
+                <w:sz w:val="18"/>
+              </w:rPr>
+              <w:t xml:space="preserve">· </w:t>
+            </w:r>
+            <w:r>
+              <w:rPr>
+                <w:sz w:val="18"/>
+              </w:rPr>
+              <w:t>sealing is about the size of the hot file, not about the calendar</w:t>
+            </w:r>
+          </w:p>
+          <w:p>
+            <w:pPr>
+              <w:spacing w:after="40"/>
+            </w:pPr>
+            <w:r>
+              <w:rPr>
+                <w:color w:val="2E6DB4"/>
+                <w:sz w:val="18"/>
+              </w:rPr>
+              <w:t xml:space="preserve">· </w:t>
+            </w:r>
+            <w:r>
+              <w:rPr>
+                <w:sz w:val="18"/>
+              </w:rPr>
+              <w:t>sealing never invalidates the index: offsets stay valid because the line does not change</w:t>
+            </w:r>
+          </w:p>
+        </w:tc>
+      </w:tr>
+    </w:tbl>
+    <w:p>
+      <w:pPr>
+        <w:spacing w:after="120"/>
+      </w:pPr>
+      <w:r>
+        <w:rPr>
+          <w:i w:val="0"/>
+          <w:sz w:val="20"/>
+        </w:rPr>
+        <w:t>Everything else goes to the bronze journal. There the topic class decides the lifetime: market and intelligence traffic is the bulk of the volume and lives long enough to replay; control and health messages are small, high-value and short-lived. Finally the segment is measured: past a gigabyte it is sealed and compressed, and the index keeps pointing into it.</w:t>
+      </w:r>
+    </w:p>
+    <w:p>
+      <w:pPr>
+        <w:pageBreakBefore/>
+        <w:spacing w:before="40" w:after="120"/>
+      </w:pPr>
+      <w:r>
+        <w:rPr>
+          <w:b/>
+          <w:color w:val="8A94A0"/>
+          <w:sz w:val="22"/>
+        </w:rPr>
+        <w:t xml:space="preserve">12   </w:t>
+      </w:r>
+      <w:r>
+        <w:rPr>
+          <w:b/>
+          <w:color w:val="1B4A6F"/>
+          <w:sz w:val="38"/>
+        </w:rPr>
         <w:t>Level 2 — control, what may change behaviour</w:t>
       </w:r>
     </w:p>
@@ -3836,7 +4879,7 @@
         <w:drawing>
           <wp:inline xmlns:a="http://schemas.openxmlformats.org/drawingml/2006/main" xmlns:pic="http://schemas.openxmlformats.org/drawingml/2006/picture">
             <wp:extent cx="8509461" cy="3383279"/>
-            <wp:docPr id="9" name="Picture 9"/>
+            <wp:docPr id="11" name="Picture 11"/>
             <wp:cNvGraphicFramePr>
               <a:graphicFrameLocks noChangeAspect="1"/>
             </wp:cNvGraphicFramePr>
@@ -3848,7 +4891,7 @@
                     <pic:cNvPicPr/>
                   </pic:nvPicPr>
                   <pic:blipFill>
-                    <a:blip r:embed="rId18"/>
+                    <a:blip r:embed="rId20"/>
                     <a:stretch>
                       <a:fillRect/>
                     </a:stretch>
@@ -4009,7 +5052,7 @@
           <w:color w:val="8A94A0"/>
           <w:sz w:val="22"/>
         </w:rPr>
-        <w:t xml:space="preserve">11   </w:t>
+        <w:t xml:space="preserve">13   </w:t>
       </w:r>
       <w:r>
         <w:rPr>
@@ -4365,7 +5408,7 @@
           <w:color w:val="8A94A0"/>
           <w:sz w:val="22"/>
         </w:rPr>
-        <w:t xml:space="preserve">12   </w:t>
+        <w:t xml:space="preserve">14   </w:t>
       </w:r>
       <w:r>
         <w:rPr>
@@ -4584,7 +5627,7 @@
           <w:color w:val="5C6672"/>
           <w:sz w:val="18"/>
         </w:rPr>
-        <w:t>© 2026 CryptAlyst · designed and built by the CryptAlyst engineering team · prepared for the operator</w:t>
+        <w:t>© 2026 CryptAlyst · designed by Andrew Preston · built by the CryptAlyst engineering team</w:t>
       </w:r>
     </w:p>
     <w:p>
@@ -4596,7 +5639,7 @@
           <w:i w:val="0"/>
           <w:sz w:val="18"/>
         </w:rPr>
-        <w:t>The text lives once in content.py; the Markdown and this PDF are both generated from it, so they cannot disagree. The nine figures are drawn as SVG by diagrams.py and cover.py, rendered to PNG by render_figs.py, and placed here by build_pdf.py.</w:t>
+        <w:t>The text lives once in content.py; the Markdown and this PDF are both generated from it, so they cannot disagree. The figures are drawn as SVG by diagrams.py and cover.py, rendered to PNG by render_figs.py, and placed here by build_pdf.py.</w:t>
       </w:r>
     </w:p>
     <w:tbl>

</xml_diff>

<commit_message>
Domain model: levels renumbered from 1 and sections ordered by level
Level 0 is now Level 1, and everything shifts with it: the envelope is Level 2, the
four context chapters and control are Level 3, the lake, the stores and the decision
tree are Level 4, and the filesystem is Level 5.

The running order is now declared in content.py rather than left to the order the
sections happened to be written in, so control (Level 3) no longer appears after
beneath the lake (Level 5). Contents, Markdown headings and the reading guide all
follow the same numbers.
</commit_message>
<xml_diff>
--- a/docs/domain/CryptAlyst-Domain-Model.docx
+++ b/docs/domain/CryptAlyst-Domain-Model.docx
@@ -152,7 +152,7 @@
                 <w:color w:val="18202A"/>
                 <w:sz w:val="19"/>
               </w:rPr>
-              <w:t>Level 0 — the context map</w:t>
+              <w:t>Level 1 — the context map</w:t>
             </w:r>
           </w:p>
           <w:p>
@@ -185,7 +185,7 @@
                 <w:color w:val="18202A"/>
                 <w:sz w:val="19"/>
               </w:rPr>
-              <w:t>Level 1 — the envelope, the only thing that travels</w:t>
+              <w:t>Level 2 — the envelope, the only thing that travels</w:t>
             </w:r>
           </w:p>
           <w:p>
@@ -218,7 +218,7 @@
                 <w:color w:val="18202A"/>
                 <w:sz w:val="19"/>
               </w:rPr>
-              <w:t>Level 2 — market data, the only process that talks to the exchange</w:t>
+              <w:t>Level 3 — market data, the only process that talks to the exchange</w:t>
             </w:r>
           </w:p>
           <w:p>
@@ -251,7 +251,7 @@
                 <w:color w:val="18202A"/>
                 <w:sz w:val="19"/>
               </w:rPr>
-              <w:t>Level 2 — the book, the aggregate that decides</w:t>
+              <w:t>Level 3 — the book, the aggregate that decides</w:t>
             </w:r>
           </w:p>
           <w:p>
@@ -284,7 +284,7 @@
                 <w:color w:val="18202A"/>
                 <w:sz w:val="19"/>
               </w:rPr>
-              <w:t>Level 2 — the gate, what must pass before money moves</w:t>
+              <w:t>Level 3 — the gate, what must pass before money moves</w:t>
             </w:r>
           </w:p>
           <w:p>
@@ -317,7 +317,7 @@
                 <w:color w:val="18202A"/>
                 <w:sz w:val="19"/>
               </w:rPr>
-              <w:t>Level 2 — the recorder, the only writer</w:t>
+              <w:t>Level 3 — the recorder, the only writer</w:t>
             </w:r>
           </w:p>
           <w:p>
@@ -356,7 +356,40 @@
                 <w:color w:val="18202A"/>
                 <w:sz w:val="19"/>
               </w:rPr>
-              <w:t>Level 3 — the lake, what is actually on disk</w:t>
+              <w:t>Level 3 — control, what may change behaviour</w:t>
+            </w:r>
+          </w:p>
+          <w:p>
+            <w:pPr>
+              <w:spacing w:after="100"/>
+              <w:ind w:left="403"/>
+            </w:pPr>
+            <w:r>
+              <w:rPr>
+                <w:color w:val="5C6672"/>
+                <w:sz w:val="16"/>
+              </w:rPr>
+              <w:t>What may change behaviour — supervise and stop — and what STOP must never touch.</w:t>
+            </w:r>
+          </w:p>
+          <w:p>
+            <w:pPr>
+              <w:spacing w:after="100"/>
+            </w:pPr>
+            <w:r>
+              <w:rPr>
+                <w:color w:val="8A94A0"/>
+                <w:sz w:val="17"/>
+              </w:rPr>
+              <w:t xml:space="preserve">09   </w:t>
+            </w:r>
+            <w:r>
+              <w:rPr>
+                <w:b/>
+                <w:color w:val="18202A"/>
+                <w:sz w:val="19"/>
+              </w:rPr>
+              <w:t>Level 4 — the lake, what is actually on disk</w:t>
             </w:r>
           </w:p>
           <w:p>
@@ -381,39 +414,6 @@
                 <w:color w:val="8A94A0"/>
                 <w:sz w:val="17"/>
               </w:rPr>
-              <w:t xml:space="preserve">09   </w:t>
-            </w:r>
-            <w:r>
-              <w:rPr>
-                <w:b/>
-                <w:color w:val="18202A"/>
-                <w:sz w:val="19"/>
-              </w:rPr>
-              <w:t>Level 4 — beneath the lake</w:t>
-            </w:r>
-          </w:p>
-          <w:p>
-            <w:pPr>
-              <w:spacing w:after="100"/>
-              <w:ind w:left="403"/>
-            </w:pPr>
-            <w:r>
-              <w:rPr>
-                <w:color w:val="5C6672"/>
-                <w:sz w:val="16"/>
-              </w:rPr>
-              <w:t>The filesystem properties that let a case file be called evidence a year later.</w:t>
-            </w:r>
-          </w:p>
-          <w:p>
-            <w:pPr>
-              <w:spacing w:after="100"/>
-            </w:pPr>
-            <w:r>
-              <w:rPr>
-                <w:color w:val="8A94A0"/>
-                <w:sz w:val="17"/>
-              </w:rPr>
               <w:t xml:space="preserve">10   </w:t>
             </w:r>
             <w:r>
@@ -422,7 +422,7 @@
                 <w:color w:val="18202A"/>
                 <w:sz w:val="19"/>
               </w:rPr>
-              <w:t>Level 3 — the data stores, as they exist</w:t>
+              <w:t>Level 4 — the data stores, as they exist</w:t>
             </w:r>
           </w:p>
           <w:p>
@@ -455,7 +455,7 @@
                 <w:color w:val="18202A"/>
                 <w:sz w:val="19"/>
               </w:rPr>
-              <w:t>Level 3 — how the lake chooses</w:t>
+              <w:t>Level 4 — how the lake chooses</w:t>
             </w:r>
           </w:p>
           <w:p>
@@ -488,7 +488,7 @@
                 <w:color w:val="18202A"/>
                 <w:sz w:val="19"/>
               </w:rPr>
-              <w:t>Level 2 — control, what may change behaviour</w:t>
+              <w:t>Level 5 — beneath the lake</w:t>
             </w:r>
           </w:p>
           <w:p>
@@ -501,7 +501,7 @@
                 <w:color w:val="5C6672"/>
                 <w:sz w:val="16"/>
               </w:rPr>
-              <w:t>What may change behaviour — supervise and stop — and what STOP must never touch.</w:t>
+              <w:t>The filesystem properties that let a case file be called evidence a year later.</w:t>
             </w:r>
           </w:p>
           <w:p>
@@ -1238,7 +1238,7 @@
               <w:rPr>
                 <w:sz w:val="17"/>
               </w:rPr>
-              <w:t>0</w:t>
+              <w:t>1</w:t>
             </w:r>
           </w:p>
         </w:tc>
@@ -1282,50 +1282,6 @@
               <w:rPr>
                 <w:sz w:val="17"/>
               </w:rPr>
-              <w:t>1</w:t>
-            </w:r>
-          </w:p>
-        </w:tc>
-        <w:tc>
-          <w:tcPr>
-            <w:tcW w:type="dxa" w:w="4797"/>
-          </w:tcPr>
-          <w:p>
-            <w:r/>
-            <w:r>
-              <w:rPr>
-                <w:sz w:val="17"/>
-              </w:rPr>
-              <w:t>what are the parts, and what do they own?</w:t>
-            </w:r>
-          </w:p>
-        </w:tc>
-        <w:tc>
-          <w:tcPr>
-            <w:tcW w:type="dxa" w:w="4797"/>
-          </w:tcPr>
-          <w:p>
-            <w:r/>
-            <w:r>
-              <w:rPr>
-                <w:sz w:val="17"/>
-              </w:rPr>
-              <w:t>the seven contexts</w:t>
-            </w:r>
-          </w:p>
-        </w:tc>
-      </w:tr>
-      <w:tr>
-        <w:tc>
-          <w:tcPr>
-            <w:tcW w:type="dxa" w:w="4797"/>
-          </w:tcPr>
-          <w:p>
-            <w:r/>
-            <w:r>
-              <w:rPr>
-                <w:sz w:val="17"/>
-              </w:rPr>
               <w:t>2</w:t>
             </w:r>
           </w:p>
@@ -1340,7 +1296,7 @@
               <w:rPr>
                 <w:sz w:val="17"/>
               </w:rPr>
-              <w:t>what is inside one part?</w:t>
+              <w:t>what travels between the parts?</w:t>
             </w:r>
           </w:p>
         </w:tc>
@@ -1354,7 +1310,7 @@
               <w:rPr>
                 <w:sz w:val="17"/>
               </w:rPr>
-              <w:t>a figure per context</w:t>
+              <w:t>the envelope</w:t>
             </w:r>
           </w:p>
         </w:tc>
@@ -1384,7 +1340,7 @@
               <w:rPr>
                 <w:sz w:val="17"/>
               </w:rPr>
-              <w:t>what is the record, and what is beneath it?</w:t>
+              <w:t>what is inside one part?</w:t>
             </w:r>
           </w:p>
         </w:tc>
@@ -1398,7 +1354,95 @@
               <w:rPr>
                 <w:sz w:val="17"/>
               </w:rPr>
-              <w:t>the lake and the filesystem</w:t>
+              <w:t>one figure per context</w:t>
+            </w:r>
+          </w:p>
+        </w:tc>
+      </w:tr>
+      <w:tr>
+        <w:tc>
+          <w:tcPr>
+            <w:tcW w:type="dxa" w:w="4797"/>
+          </w:tcPr>
+          <w:p>
+            <w:r/>
+            <w:r>
+              <w:rPr>
+                <w:sz w:val="17"/>
+              </w:rPr>
+              <w:t>4</w:t>
+            </w:r>
+          </w:p>
+        </w:tc>
+        <w:tc>
+          <w:tcPr>
+            <w:tcW w:type="dxa" w:w="4797"/>
+          </w:tcPr>
+          <w:p>
+            <w:r/>
+            <w:r>
+              <w:rPr>
+                <w:sz w:val="17"/>
+              </w:rPr>
+              <w:t>what is the record, and where does it live?</w:t>
+            </w:r>
+          </w:p>
+        </w:tc>
+        <w:tc>
+          <w:tcPr>
+            <w:tcW w:type="dxa" w:w="4797"/>
+          </w:tcPr>
+          <w:p>
+            <w:r/>
+            <w:r>
+              <w:rPr>
+                <w:sz w:val="17"/>
+              </w:rPr>
+              <w:t>the lake and the data stores</w:t>
+            </w:r>
+          </w:p>
+        </w:tc>
+      </w:tr>
+      <w:tr>
+        <w:tc>
+          <w:tcPr>
+            <w:tcW w:type="dxa" w:w="4797"/>
+          </w:tcPr>
+          <w:p>
+            <w:r/>
+            <w:r>
+              <w:rPr>
+                <w:sz w:val="17"/>
+              </w:rPr>
+              <w:t>5</w:t>
+            </w:r>
+          </w:p>
+        </w:tc>
+        <w:tc>
+          <w:tcPr>
+            <w:tcW w:type="dxa" w:w="4797"/>
+          </w:tcPr>
+          <w:p>
+            <w:r/>
+            <w:r>
+              <w:rPr>
+                <w:sz w:val="17"/>
+              </w:rPr>
+              <w:t>what is beneath the record?</w:t>
+            </w:r>
+          </w:p>
+        </w:tc>
+        <w:tc>
+          <w:tcPr>
+            <w:tcW w:type="dxa" w:w="4797"/>
+          </w:tcPr>
+          <w:p>
+            <w:r/>
+            <w:r>
+              <w:rPr>
+                <w:sz w:val="17"/>
+              </w:rPr>
+              <w:t>the filesystem</w:t>
             </w:r>
           </w:p>
         </w:tc>
@@ -1423,7 +1467,7 @@
           <w:color w:val="1B4A6F"/>
           <w:sz w:val="38"/>
         </w:rPr>
-        <w:t>Level 0 — the context map</w:t>
+        <w:t>Level 1 — the context map</w:t>
       </w:r>
     </w:p>
     <w:p>
@@ -1921,7 +1965,7 @@
           <w:color w:val="1B4A6F"/>
           <w:sz w:val="38"/>
         </w:rPr>
-        <w:t>Level 1 — the envelope, the only thing that travels</w:t>
+        <w:t>Level 2 — the envelope, the only thing that travels</w:t>
       </w:r>
     </w:p>
     <w:p>
@@ -2138,7 +2182,7 @@
           <w:color w:val="1B4A6F"/>
           <w:sz w:val="38"/>
         </w:rPr>
-        <w:t>Level 2 — market data, the only process that talks to the exchange</w:t>
+        <w:t>Level 3 — market data, the only process that talks to the exchange</w:t>
       </w:r>
     </w:p>
     <w:p>
@@ -2504,7 +2548,7 @@
           <w:color w:val="1B4A6F"/>
           <w:sz w:val="38"/>
         </w:rPr>
-        <w:t>Level 2 — the book, the aggregate that decides</w:t>
+        <w:t>Level 3 — the book, the aggregate that decides</w:t>
       </w:r>
     </w:p>
     <w:p>
@@ -2721,7 +2765,7 @@
           <w:color w:val="1B4A6F"/>
           <w:sz w:val="38"/>
         </w:rPr>
-        <w:t>Level 2 — the gate, what must pass before money moves</w:t>
+        <w:t>Level 3 — the gate, what must pass before money moves</w:t>
       </w:r>
     </w:p>
     <w:p>
@@ -3073,7 +3117,7 @@
           <w:color w:val="1B4A6F"/>
           <w:sz w:val="38"/>
         </w:rPr>
-        <w:t>Level 2 — the recorder, the only writer</w:t>
+        <w:t>Level 3 — the recorder, the only writer</w:t>
       </w:r>
     </w:p>
     <w:p>
@@ -3290,7 +3334,224 @@
           <w:color w:val="1B4A6F"/>
           <w:sz w:val="38"/>
         </w:rPr>
-        <w:t>Level 3 — the lake, what is actually on disk</w:t>
+        <w:t>Level 3 — control, what may change behaviour</w:t>
+      </w:r>
+    </w:p>
+    <w:p>
+      <w:pPr>
+        <w:spacing w:before="0" w:after="160"/>
+        <w:shd w:val="clear" w:fill="EEF3F8"/>
+        <w:pBdr>
+          <w:left w:val="single" w:sz="24" w:space="8" w:color="2E6DB4"/>
+        </w:pBdr>
+      </w:pPr>
+      <w:r>
+        <w:rPr>
+          <w:b/>
+          <w:color w:val="2E6DB4"/>
+          <w:sz w:val="15"/>
+        </w:rPr>
+        <w:t xml:space="preserve">WHAT THIS SHOWS   </w:t>
+      </w:r>
+      <w:r>
+        <w:rPr>
+          <w:color w:val="18202A"/>
+          <w:sz w:val="19"/>
+        </w:rPr>
+        <w:t>What may change behaviour — supervise and stop — and what STOP must never touch.</w:t>
+      </w:r>
+    </w:p>
+    <w:p>
+      <w:pPr>
+        <w:spacing w:after="40"/>
+        <w:jc w:val="center"/>
+      </w:pPr>
+      <w:r>
+        <w:drawing>
+          <wp:inline xmlns:a="http://schemas.openxmlformats.org/drawingml/2006/main" xmlns:pic="http://schemas.openxmlformats.org/drawingml/2006/picture">
+            <wp:extent cx="8509461" cy="3383279"/>
+            <wp:docPr id="8" name="Picture 8"/>
+            <wp:cNvGraphicFramePr>
+              <a:graphicFrameLocks noChangeAspect="1"/>
+            </wp:cNvGraphicFramePr>
+            <a:graphic>
+              <a:graphicData uri="http://schemas.openxmlformats.org/drawingml/2006/picture">
+                <pic:pic>
+                  <pic:nvPicPr>
+                    <pic:cNvPr id="0" name="08-control.png"/>
+                    <pic:cNvPicPr/>
+                  </pic:nvPicPr>
+                  <pic:blipFill>
+                    <a:blip r:embed="rId17"/>
+                    <a:stretch>
+                      <a:fillRect/>
+                    </a:stretch>
+                  </pic:blipFill>
+                  <pic:spPr>
+                    <a:xfrm>
+                      <a:off x="0" y="0"/>
+                      <a:ext cx="8509461" cy="3383279"/>
+                    </a:xfrm>
+                    <a:prstGeom prst="rect"/>
+                  </pic:spPr>
+                </pic:pic>
+              </a:graphicData>
+            </a:graphic>
+          </wp:inline>
+        </w:drawing>
+      </w:r>
+    </w:p>
+    <w:p>
+      <w:pPr>
+        <w:spacing w:after="120"/>
+        <w:jc w:val="center"/>
+      </w:pPr>
+      <w:r>
+        <w:rPr>
+          <w:i/>
+          <w:color w:val="8A94A0"/>
+          <w:sz w:val="16"/>
+        </w:rPr>
+        <w:t>Figure 8 — The supervisor, the stop flag and the heartbeat, and what STOP must never touch.</w:t>
+      </w:r>
+    </w:p>
+    <w:tbl>
+      <w:tblPr>
+        <w:tblW w:type="auto" w:w="0"/>
+        <w:tblLayout w:type="fixed"/>
+        <w:tblLook w:firstColumn="1" w:firstRow="1" w:lastColumn="0" w:lastRow="0" w:noHBand="0" w:noVBand="1" w:val="04A0"/>
+      </w:tblPr>
+      <w:tblGrid>
+        <w:gridCol w:w="7195"/>
+        <w:gridCol w:w="7195"/>
+      </w:tblGrid>
+      <w:tr>
+        <w:tc>
+          <w:tcPr>
+            <w:tcW w:type="dxa" w:w="8784"/>
+          </w:tcPr>
+          <w:p>
+            <w:r/>
+            <w:r>
+              <w:rPr>
+                <w:sz w:val="19"/>
+              </w:rPr>
+              <w:t>STOP is the most important verb in the platform, so it is defined precisely. It kills every trading process, writes a flag that every gate reads, publishes a control envelope on the bus, and resets books and statistics after archiving them. It must never stop market data, the recorder or the explorer: an operator needs the record most at the moment they stop trading.</w:t>
+            </w:r>
+          </w:p>
+        </w:tc>
+        <w:tc>
+          <w:tcPr>
+            <w:tcW w:type="dxa" w:w="5472"/>
+          </w:tcPr>
+          <w:p>
+            <w:pPr>
+              <w:spacing w:after="40"/>
+            </w:pPr>
+            <w:r/>
+            <w:r>
+              <w:rPr>
+                <w:color w:val="2E6DB4"/>
+                <w:sz w:val="18"/>
+              </w:rPr>
+              <w:t xml:space="preserve">· </w:t>
+            </w:r>
+            <w:r>
+              <w:rPr>
+                <w:sz w:val="18"/>
+              </w:rPr>
+              <w:t>STOP kills trading, writes the flag, publishes system.control, resets the books</w:t>
+            </w:r>
+          </w:p>
+          <w:p>
+            <w:pPr>
+              <w:spacing w:after="40"/>
+            </w:pPr>
+            <w:r>
+              <w:rPr>
+                <w:color w:val="2E6DB4"/>
+                <w:sz w:val="18"/>
+              </w:rPr>
+              <w:t xml:space="preserve">· </w:t>
+            </w:r>
+            <w:r>
+              <w:rPr>
+                <w:sz w:val="18"/>
+              </w:rPr>
+              <w:t>STOP leaves market data, the recorder and the explorer running</w:t>
+            </w:r>
+          </w:p>
+          <w:p>
+            <w:pPr>
+              <w:spacing w:after="40"/>
+            </w:pPr>
+            <w:r>
+              <w:rPr>
+                <w:color w:val="2E6DB4"/>
+                <w:sz w:val="18"/>
+              </w:rPr>
+              <w:t xml:space="preserve">· </w:t>
+            </w:r>
+            <w:r>
+              <w:rPr>
+                <w:sz w:val="18"/>
+              </w:rPr>
+              <w:t>starting the platform does not start trading unless it is asked to</w:t>
+            </w:r>
+          </w:p>
+          <w:p>
+            <w:pPr>
+              <w:spacing w:after="40"/>
+            </w:pPr>
+            <w:r>
+              <w:rPr>
+                <w:color w:val="2E6DB4"/>
+                <w:sz w:val="18"/>
+              </w:rPr>
+              <w:t xml:space="preserve">· </w:t>
+            </w:r>
+            <w:r>
+              <w:rPr>
+                <w:sz w:val="18"/>
+              </w:rPr>
+              <w:t>a stopped book is visibly stopped; it does not linger as a row on a dashboard</w:t>
+            </w:r>
+          </w:p>
+        </w:tc>
+      </w:tr>
+    </w:tbl>
+    <w:p>
+      <w:pPr>
+        <w:spacing w:after="120"/>
+      </w:pPr>
+      <w:r>
+        <w:rPr>
+          <w:i w:val="0"/>
+          <w:sz w:val="20"/>
+        </w:rPr>
+        <w:t>The inverse is equally deliberate: no data path can stop the platform. A feed outage, a dead book or a missing consumer degrades what you see; only the control plane changes what the platform will do next.</w:t>
+      </w:r>
+    </w:p>
+    <w:p>
+      <w:pPr>
+        <w:pageBreakBefore/>
+        <w:spacing w:before="40" w:after="120"/>
+      </w:pPr>
+      <w:r>
+        <w:rPr>
+          <w:b/>
+          <w:color w:val="8A94A0"/>
+          <w:sz w:val="22"/>
+        </w:rPr>
+        <w:t xml:space="preserve">09   </w:t>
+      </w:r>
+      <w:r>
+        <w:rPr>
+          <w:b/>
+          <w:color w:val="1B4A6F"/>
+          <w:sz w:val="38"/>
+        </w:rPr>
+        <w:t>Level 4 — the lake, what is actually on disk</w:t>
       </w:r>
     </w:p>
     <w:p>
@@ -3326,7 +3587,7 @@
         <w:drawing>
           <wp:inline xmlns:a="http://schemas.openxmlformats.org/drawingml/2006/main" xmlns:pic="http://schemas.openxmlformats.org/drawingml/2006/picture">
             <wp:extent cx="6640830" cy="2880360"/>
-            <wp:docPr id="8" name="Picture 8"/>
+            <wp:docPr id="9" name="Picture 9"/>
             <wp:cNvGraphicFramePr>
               <a:graphicFrameLocks noChangeAspect="1"/>
             </wp:cNvGraphicFramePr>
@@ -3338,7 +3599,7 @@
                     <pic:cNvPicPr/>
                   </pic:nvPicPr>
                   <pic:blipFill>
-                    <a:blip r:embed="rId17"/>
+                    <a:blip r:embed="rId18"/>
                     <a:stretch>
                       <a:fillRect/>
                     </a:stretch>
@@ -3648,304 +3909,6 @@
           <w:color w:val="8A94A0"/>
           <w:sz w:val="22"/>
         </w:rPr>
-        <w:t xml:space="preserve">09   </w:t>
-      </w:r>
-      <w:r>
-        <w:rPr>
-          <w:b/>
-          <w:color w:val="1B4A6F"/>
-          <w:sz w:val="38"/>
-        </w:rPr>
-        <w:t>Level 4 — beneath the lake</w:t>
-      </w:r>
-    </w:p>
-    <w:p>
-      <w:pPr>
-        <w:spacing w:before="0" w:after="160"/>
-        <w:shd w:val="clear" w:fill="EEF3F8"/>
-        <w:pBdr>
-          <w:left w:val="single" w:sz="24" w:space="8" w:color="2E6DB4"/>
-        </w:pBdr>
-      </w:pPr>
-      <w:r>
-        <w:rPr>
-          <w:b/>
-          <w:color w:val="2E6DB4"/>
-          <w:sz w:val="15"/>
-        </w:rPr>
-        <w:t xml:space="preserve">WHAT THIS SHOWS   </w:t>
-      </w:r>
-      <w:r>
-        <w:rPr>
-          <w:color w:val="18202A"/>
-          <w:sz w:val="19"/>
-        </w:rPr>
-        <w:t>The filesystem properties that let a case file be called evidence a year later.</w:t>
-      </w:r>
-    </w:p>
-    <w:p>
-      <w:pPr>
-        <w:spacing w:after="120"/>
-      </w:pPr>
-      <w:r>
-        <w:rPr>
-          <w:i w:val="0"/>
-          <w:sz w:val="20"/>
-        </w:rPr>
-        <w:t>Underneath the lake there is a filesystem and nothing else. The properties that follow from that are worth stating plainly, because they are the reason a case file can be called evidence.</w:t>
-      </w:r>
-    </w:p>
-    <w:tbl>
-      <w:tblPr>
-        <w:tblStyle w:val="TableGrid"/>
-        <w:tblW w:type="auto" w:w="0"/>
-        <w:jc w:val="center"/>
-        <w:tblLook w:firstColumn="1" w:firstRow="1" w:lastColumn="0" w:lastRow="0" w:noHBand="0" w:noVBand="1" w:val="04A0"/>
-      </w:tblPr>
-      <w:tblGrid>
-        <w:gridCol w:w="7195"/>
-        <w:gridCol w:w="7195"/>
-      </w:tblGrid>
-      <w:tr>
-        <w:tc>
-          <w:tcPr>
-            <w:tcW w:type="dxa" w:w="7195"/>
-            <w:shd w:fill="F1F4F7"/>
-          </w:tcPr>
-          <w:p>
-            <w:r/>
-            <w:r>
-              <w:rPr>
-                <w:b/>
-                <w:color w:val="5C6672"/>
-                <w:sz w:val="14"/>
-              </w:rPr>
-              <w:t>PROPERTY</w:t>
-            </w:r>
-          </w:p>
-        </w:tc>
-        <w:tc>
-          <w:tcPr>
-            <w:tcW w:type="dxa" w:w="7195"/>
-            <w:shd w:fill="F1F4F7"/>
-          </w:tcPr>
-          <w:p>
-            <w:r/>
-            <w:r>
-              <w:rPr>
-                <w:b/>
-                <w:color w:val="5C6672"/>
-                <w:sz w:val="14"/>
-              </w:rPr>
-              <w:t>CONSEQUENCE</w:t>
-            </w:r>
-          </w:p>
-        </w:tc>
-      </w:tr>
-      <w:tr>
-        <w:tc>
-          <w:tcPr>
-            <w:tcW w:type="dxa" w:w="7195"/>
-          </w:tcPr>
-          <w:p>
-            <w:r/>
-            <w:r>
-              <w:rPr>
-                <w:sz w:val="17"/>
-              </w:rPr>
-              <w:t>one line, one envelope, append only</w:t>
-            </w:r>
-          </w:p>
-        </w:tc>
-        <w:tc>
-          <w:tcPr>
-            <w:tcW w:type="dxa" w:w="7195"/>
-          </w:tcPr>
-          <w:p>
-            <w:r/>
-            <w:r>
-              <w:rPr>
-                <w:sz w:val="17"/>
-              </w:rPr>
-              <w:t>a line never changes after it is written</w:t>
-            </w:r>
-          </w:p>
-        </w:tc>
-      </w:tr>
-      <w:tr>
-        <w:tc>
-          <w:tcPr>
-            <w:tcW w:type="dxa" w:w="7195"/>
-          </w:tcPr>
-          <w:p>
-            <w:r/>
-            <w:r>
-              <w:rPr>
-                <w:sz w:val="17"/>
-              </w:rPr>
-              <w:t>plain UTF-8 JSON</w:t>
-            </w:r>
-          </w:p>
-        </w:tc>
-        <w:tc>
-          <w:tcPr>
-            <w:tcW w:type="dxa" w:w="7195"/>
-          </w:tcPr>
-          <w:p>
-            <w:r/>
-            <w:r>
-              <w:rPr>
-                <w:sz w:val="17"/>
-              </w:rPr>
-              <w:t>grep, jq, awk and a shell are enough to read it</w:t>
-            </w:r>
-          </w:p>
-        </w:tc>
-      </w:tr>
-      <w:tr>
-        <w:tc>
-          <w:tcPr>
-            <w:tcW w:type="dxa" w:w="7195"/>
-          </w:tcPr>
-          <w:p>
-            <w:r/>
-            <w:r>
-              <w:rPr>
-                <w:sz w:val="17"/>
-              </w:rPr>
-              <w:t>no service dependency to read</w:t>
-            </w:r>
-          </w:p>
-        </w:tc>
-        <w:tc>
-          <w:tcPr>
-            <w:tcW w:type="dxa" w:w="7195"/>
-          </w:tcPr>
-          <w:p>
-            <w:r/>
-            <w:r>
-              <w:rPr>
-                <w:sz w:val="17"/>
-              </w:rPr>
-              <w:t>an investigator does not need the platform running</w:t>
-            </w:r>
-          </w:p>
-        </w:tc>
-      </w:tr>
-      <w:tr>
-        <w:tc>
-          <w:tcPr>
-            <w:tcW w:type="dxa" w:w="7195"/>
-          </w:tcPr>
-          <w:p>
-            <w:r/>
-            <w:r>
-              <w:rPr>
-                <w:sz w:val="17"/>
-              </w:rPr>
-              <w:t>rotation by size, then gzip</w:t>
-            </w:r>
-          </w:p>
-        </w:tc>
-        <w:tc>
-          <w:tcPr>
-            <w:tcW w:type="dxa" w:w="7195"/>
-          </w:tcPr>
-          <w:p>
-            <w:r/>
-            <w:r>
-              <w:rPr>
-                <w:sz w:val="17"/>
-              </w:rPr>
-              <w:t>the working journal stays small and fast</w:t>
-            </w:r>
-          </w:p>
-        </w:tc>
-      </w:tr>
-      <w:tr>
-        <w:tc>
-          <w:tcPr>
-            <w:tcW w:type="dxa" w:w="7195"/>
-          </w:tcPr>
-          <w:p>
-            <w:r/>
-            <w:r>
-              <w:rPr>
-                <w:sz w:val="17"/>
-              </w:rPr>
-              <w:t>expiry by window</w:t>
-            </w:r>
-          </w:p>
-        </w:tc>
-        <w:tc>
-          <w:tcPr>
-            <w:tcW w:type="dxa" w:w="7195"/>
-          </w:tcPr>
-          <w:p>
-            <w:r/>
-            <w:r>
-              <w:rPr>
-                <w:sz w:val="17"/>
-              </w:rPr>
-              <w:t>the record has a stated lifetime, not an accidental one</w:t>
-            </w:r>
-          </w:p>
-        </w:tc>
-      </w:tr>
-      <w:tr>
-        <w:tc>
-          <w:tcPr>
-            <w:tcW w:type="dxa" w:w="7195"/>
-          </w:tcPr>
-          <w:p>
-            <w:r/>
-            <w:r>
-              <w:rPr>
-                <w:sz w:val="17"/>
-              </w:rPr>
-              <w:t>offsets in memory, rebuilt on boot</w:t>
-            </w:r>
-          </w:p>
-        </w:tc>
-        <w:tc>
-          <w:tcPr>
-            <w:tcW w:type="dxa" w:w="7195"/>
-          </w:tcPr>
-          <w:p>
-            <w:r/>
-            <w:r>
-              <w:rPr>
-                <w:sz w:val="17"/>
-              </w:rPr>
-              <w:t>the index is disposable, the journal is not</w:t>
-            </w:r>
-          </w:p>
-        </w:tc>
-      </w:tr>
-    </w:tbl>
-    <w:p>
-      <w:pPr>
-        <w:spacing w:after="120"/>
-      </w:pPr>
-      <w:r>
-        <w:rPr>
-          <w:i w:val="0"/>
-          <w:sz w:val="20"/>
-        </w:rPr>
-        <w:t>The separation matters architecturally: the journal is the durable fact, the index is a convenience that can be thrown away and rebuilt. A corruption in the index costs a restart; a corruption in the journal costs history. Only the second one is serious, and the design keeps them apart.</w:t>
-      </w:r>
-    </w:p>
-    <w:p>
-      <w:pPr>
-        <w:pageBreakBefore/>
-        <w:spacing w:before="40" w:after="120"/>
-      </w:pPr>
-      <w:r>
-        <w:rPr>
-          <w:b/>
-          <w:color w:val="8A94A0"/>
-          <w:sz w:val="22"/>
-        </w:rPr>
         <w:t xml:space="preserve">10   </w:t>
       </w:r>
       <w:r>
@@ -3954,7 +3917,7 @@
           <w:color w:val="1B4A6F"/>
           <w:sz w:val="38"/>
         </w:rPr>
-        <w:t>Level 3 — the data stores, as they exist</w:t>
+        <w:t>Level 4 — the data stores, as they exist</w:t>
       </w:r>
     </w:p>
     <w:p>
@@ -3990,7 +3953,7 @@
         <w:drawing>
           <wp:inline xmlns:a="http://schemas.openxmlformats.org/drawingml/2006/main" xmlns:pic="http://schemas.openxmlformats.org/drawingml/2006/picture">
             <wp:extent cx="6830568" cy="2880360"/>
-            <wp:docPr id="9" name="Picture 9"/>
+            <wp:docPr id="10" name="Picture 10"/>
             <wp:cNvGraphicFramePr>
               <a:graphicFrameLocks noChangeAspect="1"/>
             </wp:cNvGraphicFramePr>
@@ -4002,7 +3965,7 @@
                     <pic:cNvPicPr/>
                   </pic:nvPicPr>
                   <pic:blipFill>
-                    <a:blip r:embed="rId18"/>
+                    <a:blip r:embed="rId19"/>
                     <a:stretch>
                       <a:fillRect/>
                     </a:stretch>
@@ -4626,7 +4589,7 @@
           <w:color w:val="1B4A6F"/>
           <w:sz w:val="38"/>
         </w:rPr>
-        <w:t>Level 3 — how the lake chooses</w:t>
+        <w:t>Level 4 — how the lake chooses</w:t>
       </w:r>
     </w:p>
     <w:p>
@@ -4662,7 +4625,7 @@
         <w:drawing>
           <wp:inline xmlns:a="http://schemas.openxmlformats.org/drawingml/2006/main" xmlns:pic="http://schemas.openxmlformats.org/drawingml/2006/picture">
             <wp:extent cx="7200313" cy="3383280"/>
-            <wp:docPr id="10" name="Picture 10"/>
+            <wp:docPr id="11" name="Picture 11"/>
             <wp:cNvGraphicFramePr>
               <a:graphicFrameLocks noChangeAspect="1"/>
             </wp:cNvGraphicFramePr>
@@ -4674,7 +4637,7 @@
                     <pic:cNvPicPr/>
                   </pic:nvPicPr>
                   <pic:blipFill>
-                    <a:blip r:embed="rId19"/>
+                    <a:blip r:embed="rId20"/>
                     <a:stretch>
                       <a:fillRect/>
                     </a:stretch>
@@ -4843,7 +4806,7 @@
           <w:color w:val="1B4A6F"/>
           <w:sz w:val="38"/>
         </w:rPr>
-        <w:t>Level 2 — control, what may change behaviour</w:t>
+        <w:t>Level 5 — beneath the lake</w:t>
       </w:r>
     </w:p>
     <w:p>
@@ -4867,67 +4830,26 @@
           <w:color w:val="18202A"/>
           <w:sz w:val="19"/>
         </w:rPr>
-        <w:t>What may change behaviour — supervise and stop — and what STOP must never touch.</w:t>
-      </w:r>
-    </w:p>
-    <w:p>
-      <w:pPr>
-        <w:spacing w:after="40"/>
-        <w:jc w:val="center"/>
-      </w:pPr>
-      <w:r>
-        <w:drawing>
-          <wp:inline xmlns:a="http://schemas.openxmlformats.org/drawingml/2006/main" xmlns:pic="http://schemas.openxmlformats.org/drawingml/2006/picture">
-            <wp:extent cx="8509461" cy="3383279"/>
-            <wp:docPr id="11" name="Picture 11"/>
-            <wp:cNvGraphicFramePr>
-              <a:graphicFrameLocks noChangeAspect="1"/>
-            </wp:cNvGraphicFramePr>
-            <a:graphic>
-              <a:graphicData uri="http://schemas.openxmlformats.org/drawingml/2006/picture">
-                <pic:pic>
-                  <pic:nvPicPr>
-                    <pic:cNvPr id="0" name="08-control.png"/>
-                    <pic:cNvPicPr/>
-                  </pic:nvPicPr>
-                  <pic:blipFill>
-                    <a:blip r:embed="rId20"/>
-                    <a:stretch>
-                      <a:fillRect/>
-                    </a:stretch>
-                  </pic:blipFill>
-                  <pic:spPr>
-                    <a:xfrm>
-                      <a:off x="0" y="0"/>
-                      <a:ext cx="8509461" cy="3383279"/>
-                    </a:xfrm>
-                    <a:prstGeom prst="rect"/>
-                  </pic:spPr>
-                </pic:pic>
-              </a:graphicData>
-            </a:graphic>
-          </wp:inline>
-        </w:drawing>
+        <w:t>The filesystem properties that let a case file be called evidence a year later.</w:t>
       </w:r>
     </w:p>
     <w:p>
       <w:pPr>
         <w:spacing w:after="120"/>
-        <w:jc w:val="center"/>
       </w:pPr>
       <w:r>
         <w:rPr>
-          <w:i/>
-          <w:color w:val="8A94A0"/>
-          <w:sz w:val="16"/>
+          <w:i w:val="0"/>
+          <w:sz w:val="20"/>
         </w:rPr>
-        <w:t>Figure 8 — The supervisor, the stop flag and the heartbeat, and what STOP must never touch.</w:t>
+        <w:t>Underneath the lake there is a filesystem and nothing else. The properties that follow from that are worth stating plainly, because they are the reason a case file can be called evidence.</w:t>
       </w:r>
     </w:p>
     <w:tbl>
       <w:tblPr>
+        <w:tblStyle w:val="TableGrid"/>
         <w:tblW w:type="auto" w:w="0"/>
-        <w:tblLayout w:type="fixed"/>
+        <w:jc w:val="center"/>
         <w:tblLook w:firstColumn="1" w:firstRow="1" w:lastColumn="0" w:lastRow="0" w:noHBand="0" w:noVBand="1" w:val="04A0"/>
       </w:tblPr>
       <w:tblGrid>
@@ -4937,93 +4859,215 @@
       <w:tr>
         <w:tc>
           <w:tcPr>
-            <w:tcW w:type="dxa" w:w="8784"/>
+            <w:tcW w:type="dxa" w:w="7195"/>
+            <w:shd w:fill="F1F4F7"/>
           </w:tcPr>
           <w:p>
             <w:r/>
             <w:r>
               <w:rPr>
-                <w:sz w:val="19"/>
+                <w:b/>
+                <w:color w:val="5C6672"/>
+                <w:sz w:val="14"/>
               </w:rPr>
-              <w:t>STOP is the most important verb in the platform, so it is defined precisely. It kills every trading process, writes a flag that every gate reads, publishes a control envelope on the bus, and resets books and statistics after archiving them. It must never stop market data, the recorder or the explorer: an operator needs the record most at the moment they stop trading.</w:t>
+              <w:t>PROPERTY</w:t>
             </w:r>
           </w:p>
         </w:tc>
         <w:tc>
           <w:tcPr>
-            <w:tcW w:type="dxa" w:w="5472"/>
+            <w:tcW w:type="dxa" w:w="7195"/>
+            <w:shd w:fill="F1F4F7"/>
           </w:tcPr>
           <w:p>
-            <w:pPr>
-              <w:spacing w:after="40"/>
-            </w:pPr>
             <w:r/>
             <w:r>
               <w:rPr>
-                <w:color w:val="2E6DB4"/>
-                <w:sz w:val="18"/>
+                <w:b/>
+                <w:color w:val="5C6672"/>
+                <w:sz w:val="14"/>
               </w:rPr>
-              <w:t xml:space="preserve">· </w:t>
+              <w:t>CONSEQUENCE</w:t>
             </w:r>
+          </w:p>
+        </w:tc>
+      </w:tr>
+      <w:tr>
+        <w:tc>
+          <w:tcPr>
+            <w:tcW w:type="dxa" w:w="7195"/>
+          </w:tcPr>
+          <w:p>
+            <w:r/>
             <w:r>
               <w:rPr>
-                <w:sz w:val="18"/>
+                <w:sz w:val="17"/>
               </w:rPr>
-              <w:t>STOP kills trading, writes the flag, publishes system.control, resets the books</w:t>
+              <w:t>one line, one envelope, append only</w:t>
             </w:r>
           </w:p>
+        </w:tc>
+        <w:tc>
+          <w:tcPr>
+            <w:tcW w:type="dxa" w:w="7195"/>
+          </w:tcPr>
           <w:p>
-            <w:pPr>
-              <w:spacing w:after="40"/>
-            </w:pPr>
+            <w:r/>
             <w:r>
               <w:rPr>
-                <w:color w:val="2E6DB4"/>
-                <w:sz w:val="18"/>
+                <w:sz w:val="17"/>
               </w:rPr>
-              <w:t xml:space="preserve">· </w:t>
+              <w:t>a line never changes after it is written</w:t>
             </w:r>
+          </w:p>
+        </w:tc>
+      </w:tr>
+      <w:tr>
+        <w:tc>
+          <w:tcPr>
+            <w:tcW w:type="dxa" w:w="7195"/>
+          </w:tcPr>
+          <w:p>
+            <w:r/>
             <w:r>
               <w:rPr>
-                <w:sz w:val="18"/>
+                <w:sz w:val="17"/>
               </w:rPr>
-              <w:t>STOP leaves market data, the recorder and the explorer running</w:t>
+              <w:t>plain UTF-8 JSON</w:t>
             </w:r>
           </w:p>
+        </w:tc>
+        <w:tc>
+          <w:tcPr>
+            <w:tcW w:type="dxa" w:w="7195"/>
+          </w:tcPr>
           <w:p>
-            <w:pPr>
-              <w:spacing w:after="40"/>
-            </w:pPr>
+            <w:r/>
             <w:r>
               <w:rPr>
-                <w:color w:val="2E6DB4"/>
-                <w:sz w:val="18"/>
+                <w:sz w:val="17"/>
               </w:rPr>
-              <w:t xml:space="preserve">· </w:t>
+              <w:t>grep, jq, awk and a shell are enough to read it</w:t>
             </w:r>
+          </w:p>
+        </w:tc>
+      </w:tr>
+      <w:tr>
+        <w:tc>
+          <w:tcPr>
+            <w:tcW w:type="dxa" w:w="7195"/>
+          </w:tcPr>
+          <w:p>
+            <w:r/>
             <w:r>
               <w:rPr>
-                <w:sz w:val="18"/>
+                <w:sz w:val="17"/>
               </w:rPr>
-              <w:t>starting the platform does not start trading unless it is asked to</w:t>
+              <w:t>no service dependency to read</w:t>
             </w:r>
           </w:p>
+        </w:tc>
+        <w:tc>
+          <w:tcPr>
+            <w:tcW w:type="dxa" w:w="7195"/>
+          </w:tcPr>
           <w:p>
-            <w:pPr>
-              <w:spacing w:after="40"/>
-            </w:pPr>
+            <w:r/>
             <w:r>
               <w:rPr>
-                <w:color w:val="2E6DB4"/>
-                <w:sz w:val="18"/>
+                <w:sz w:val="17"/>
               </w:rPr>
-              <w:t xml:space="preserve">· </w:t>
+              <w:t>an investigator does not need the platform running</w:t>
             </w:r>
+          </w:p>
+        </w:tc>
+      </w:tr>
+      <w:tr>
+        <w:tc>
+          <w:tcPr>
+            <w:tcW w:type="dxa" w:w="7195"/>
+          </w:tcPr>
+          <w:p>
+            <w:r/>
             <w:r>
               <w:rPr>
-                <w:sz w:val="18"/>
+                <w:sz w:val="17"/>
               </w:rPr>
-              <w:t>a stopped book is visibly stopped; it does not linger as a row on a dashboard</w:t>
+              <w:t>rotation by size, then gzip</w:t>
+            </w:r>
+          </w:p>
+        </w:tc>
+        <w:tc>
+          <w:tcPr>
+            <w:tcW w:type="dxa" w:w="7195"/>
+          </w:tcPr>
+          <w:p>
+            <w:r/>
+            <w:r>
+              <w:rPr>
+                <w:sz w:val="17"/>
+              </w:rPr>
+              <w:t>the working journal stays small and fast</w:t>
+            </w:r>
+          </w:p>
+        </w:tc>
+      </w:tr>
+      <w:tr>
+        <w:tc>
+          <w:tcPr>
+            <w:tcW w:type="dxa" w:w="7195"/>
+          </w:tcPr>
+          <w:p>
+            <w:r/>
+            <w:r>
+              <w:rPr>
+                <w:sz w:val="17"/>
+              </w:rPr>
+              <w:t>expiry by window</w:t>
+            </w:r>
+          </w:p>
+        </w:tc>
+        <w:tc>
+          <w:tcPr>
+            <w:tcW w:type="dxa" w:w="7195"/>
+          </w:tcPr>
+          <w:p>
+            <w:r/>
+            <w:r>
+              <w:rPr>
+                <w:sz w:val="17"/>
+              </w:rPr>
+              <w:t>the record has a stated lifetime, not an accidental one</w:t>
+            </w:r>
+          </w:p>
+        </w:tc>
+      </w:tr>
+      <w:tr>
+        <w:tc>
+          <w:tcPr>
+            <w:tcW w:type="dxa" w:w="7195"/>
+          </w:tcPr>
+          <w:p>
+            <w:r/>
+            <w:r>
+              <w:rPr>
+                <w:sz w:val="17"/>
+              </w:rPr>
+              <w:t>offsets in memory, rebuilt on boot</w:t>
+            </w:r>
+          </w:p>
+        </w:tc>
+        <w:tc>
+          <w:tcPr>
+            <w:tcW w:type="dxa" w:w="7195"/>
+          </w:tcPr>
+          <w:p>
+            <w:r/>
+            <w:r>
+              <w:rPr>
+                <w:sz w:val="17"/>
+              </w:rPr>
+              <w:t>the index is disposable, the journal is not</w:t>
             </w:r>
           </w:p>
         </w:tc>
@@ -5038,7 +5082,7 @@
           <w:i w:val="0"/>
           <w:sz w:val="20"/>
         </w:rPr>
-        <w:t>The inverse is equally deliberate: no data path can stop the platform. A feed outage, a dead book or a missing consumer degrades what you see; only the control plane changes what the platform will do next.</w:t>
+        <w:t>The separation matters architecturally: the journal is the durable fact, the index is a convenience that can be thrown away and rebuilt. A corruption in the index costs a restart; a corruption in the journal costs history. Only the second one is serious, and the design keeps them apart.</w:t>
       </w:r>
     </w:p>
     <w:p>

</xml_diff>

<commit_message>
Domain model: hierarchical section and figure numbering
Levels with several sections now number their children: 3.1 market data through 3.5
control, 4.1 the lake through 4.3 how the lake chooses. Levels with one section stay
single (1, 2, 5), and front and back matter carry no number.

Figures follow the section that uses them - Figure 3.1, 3.2, ... - and the figure
index lists them in that order on its own page, so the table no longer splits across
a page break. Markdown headings carry the same numbers.
</commit_message>
<xml_diff>
--- a/docs/domain/CryptAlyst-Domain-Model.docx
+++ b/docs/domain/CryptAlyst-Domain-Model.docx
@@ -59,14 +59,6 @@
       <w:r>
         <w:rPr>
           <w:b/>
-          <w:color w:val="8A94A0"/>
-          <w:sz w:val="22"/>
-        </w:rPr>
-        <w:t xml:space="preserve">00   </w:t>
-      </w:r>
-      <w:r>
-        <w:rPr>
-          <w:b/>
           <w:color w:val="1B4A6F"/>
           <w:sz w:val="38"/>
         </w:rPr>
@@ -111,7 +103,7 @@
                 <w:color w:val="8A94A0"/>
                 <w:sz w:val="17"/>
               </w:rPr>
-              <w:t xml:space="preserve">01   </w:t>
+              <w:t xml:space="preserve">—     </w:t>
             </w:r>
             <w:r>
               <w:rPr>
@@ -144,7 +136,7 @@
                 <w:color w:val="8A94A0"/>
                 <w:sz w:val="17"/>
               </w:rPr>
-              <w:t xml:space="preserve">02   </w:t>
+              <w:t xml:space="preserve">1     </w:t>
             </w:r>
             <w:r>
               <w:rPr>
@@ -152,7 +144,7 @@
                 <w:color w:val="18202A"/>
                 <w:sz w:val="19"/>
               </w:rPr>
-              <w:t>Level 1 — the context map</w:t>
+              <w:t>The context map</w:t>
             </w:r>
           </w:p>
           <w:p>
@@ -177,7 +169,7 @@
                 <w:color w:val="8A94A0"/>
                 <w:sz w:val="17"/>
               </w:rPr>
-              <w:t xml:space="preserve">03   </w:t>
+              <w:t xml:space="preserve">2     </w:t>
             </w:r>
             <w:r>
               <w:rPr>
@@ -185,7 +177,7 @@
                 <w:color w:val="18202A"/>
                 <w:sz w:val="19"/>
               </w:rPr>
-              <w:t>Level 2 — the envelope, the only thing that travels</w:t>
+              <w:t>The envelope — the only thing that travels</w:t>
             </w:r>
           </w:p>
           <w:p>
@@ -210,7 +202,7 @@
                 <w:color w:val="8A94A0"/>
                 <w:sz w:val="17"/>
               </w:rPr>
-              <w:t xml:space="preserve">04   </w:t>
+              <w:t xml:space="preserve">3.1   </w:t>
             </w:r>
             <w:r>
               <w:rPr>
@@ -218,7 +210,7 @@
                 <w:color w:val="18202A"/>
                 <w:sz w:val="19"/>
               </w:rPr>
-              <w:t>Level 3 — market data, the only process that talks to the exchange</w:t>
+              <w:t>Market data — the only process that talks to the exchange</w:t>
             </w:r>
           </w:p>
           <w:p>
@@ -243,7 +235,7 @@
                 <w:color w:val="8A94A0"/>
                 <w:sz w:val="17"/>
               </w:rPr>
-              <w:t xml:space="preserve">05   </w:t>
+              <w:t xml:space="preserve">3.2   </w:t>
             </w:r>
             <w:r>
               <w:rPr>
@@ -251,7 +243,7 @@
                 <w:color w:val="18202A"/>
                 <w:sz w:val="19"/>
               </w:rPr>
-              <w:t>Level 3 — the book, the aggregate that decides</w:t>
+              <w:t>The book — the aggregate that decides</w:t>
             </w:r>
           </w:p>
           <w:p>
@@ -276,7 +268,7 @@
                 <w:color w:val="8A94A0"/>
                 <w:sz w:val="17"/>
               </w:rPr>
-              <w:t xml:space="preserve">06   </w:t>
+              <w:t xml:space="preserve">3.3   </w:t>
             </w:r>
             <w:r>
               <w:rPr>
@@ -284,7 +276,7 @@
                 <w:color w:val="18202A"/>
                 <w:sz w:val="19"/>
               </w:rPr>
-              <w:t>Level 3 — the gate, what must pass before money moves</w:t>
+              <w:t>The gate — what must pass before money moves</w:t>
             </w:r>
           </w:p>
           <w:p>
@@ -309,7 +301,7 @@
                 <w:color w:val="8A94A0"/>
                 <w:sz w:val="17"/>
               </w:rPr>
-              <w:t xml:space="preserve">07   </w:t>
+              <w:t xml:space="preserve">3.4   </w:t>
             </w:r>
             <w:r>
               <w:rPr>
@@ -317,7 +309,7 @@
                 <w:color w:val="18202A"/>
                 <w:sz w:val="19"/>
               </w:rPr>
-              <w:t>Level 3 — the recorder, the only writer</w:t>
+              <w:t>The recorder — the only writer</w:t>
             </w:r>
           </w:p>
           <w:p>
@@ -348,7 +340,7 @@
                 <w:color w:val="8A94A0"/>
                 <w:sz w:val="17"/>
               </w:rPr>
-              <w:t xml:space="preserve">08   </w:t>
+              <w:t xml:space="preserve">3.5   </w:t>
             </w:r>
             <w:r>
               <w:rPr>
@@ -356,7 +348,7 @@
                 <w:color w:val="18202A"/>
                 <w:sz w:val="19"/>
               </w:rPr>
-              <w:t>Level 3 — control, what may change behaviour</w:t>
+              <w:t>Control — what may change behaviour</w:t>
             </w:r>
           </w:p>
           <w:p>
@@ -381,7 +373,7 @@
                 <w:color w:val="8A94A0"/>
                 <w:sz w:val="17"/>
               </w:rPr>
-              <w:t xml:space="preserve">09   </w:t>
+              <w:t xml:space="preserve">4.1   </w:t>
             </w:r>
             <w:r>
               <w:rPr>
@@ -389,7 +381,7 @@
                 <w:color w:val="18202A"/>
                 <w:sz w:val="19"/>
               </w:rPr>
-              <w:t>Level 4 — the lake, what is actually on disk</w:t>
+              <w:t>The lake — what is actually on disk</w:t>
             </w:r>
           </w:p>
           <w:p>
@@ -414,7 +406,7 @@
                 <w:color w:val="8A94A0"/>
                 <w:sz w:val="17"/>
               </w:rPr>
-              <w:t xml:space="preserve">10   </w:t>
+              <w:t xml:space="preserve">4.2   </w:t>
             </w:r>
             <w:r>
               <w:rPr>
@@ -422,7 +414,7 @@
                 <w:color w:val="18202A"/>
                 <w:sz w:val="19"/>
               </w:rPr>
-              <w:t>Level 4 — the data stores, as they exist</w:t>
+              <w:t>The data stores, as they exist</w:t>
             </w:r>
           </w:p>
           <w:p>
@@ -447,7 +439,7 @@
                 <w:color w:val="8A94A0"/>
                 <w:sz w:val="17"/>
               </w:rPr>
-              <w:t xml:space="preserve">11   </w:t>
+              <w:t xml:space="preserve">4.3   </w:t>
             </w:r>
             <w:r>
               <w:rPr>
@@ -455,7 +447,7 @@
                 <w:color w:val="18202A"/>
                 <w:sz w:val="19"/>
               </w:rPr>
-              <w:t>Level 4 — how the lake chooses</w:t>
+              <w:t>How the lake chooses</w:t>
             </w:r>
           </w:p>
           <w:p>
@@ -480,7 +472,7 @@
                 <w:color w:val="8A94A0"/>
                 <w:sz w:val="17"/>
               </w:rPr>
-              <w:t xml:space="preserve">12   </w:t>
+              <w:t xml:space="preserve">5     </w:t>
             </w:r>
             <w:r>
               <w:rPr>
@@ -488,7 +480,7 @@
                 <w:color w:val="18202A"/>
                 <w:sz w:val="19"/>
               </w:rPr>
-              <w:t>Level 5 — beneath the lake</w:t>
+              <w:t>Beneath the lake</w:t>
             </w:r>
           </w:p>
           <w:p>
@@ -513,7 +505,7 @@
                 <w:color w:val="8A94A0"/>
                 <w:sz w:val="17"/>
               </w:rPr>
-              <w:t xml:space="preserve">13   </w:t>
+              <w:t xml:space="preserve">—     </w:t>
             </w:r>
             <w:r>
               <w:rPr>
@@ -546,7 +538,7 @@
                 <w:color w:val="8A94A0"/>
                 <w:sz w:val="17"/>
               </w:rPr>
-              <w:t xml:space="preserve">14   </w:t>
+              <w:t xml:space="preserve">—     </w:t>
             </w:r>
             <w:r>
               <w:rPr>
@@ -575,7 +567,8 @@
     </w:tbl>
     <w:p>
       <w:pPr>
-        <w:spacing w:before="200" w:after="40"/>
+        <w:pageBreakBefore/>
+        <w:spacing w:before="0" w:after="80"/>
       </w:pPr>
       <w:r>
         <w:rPr>
@@ -750,7 +743,7 @@
               <w:rPr>
                 <w:sz w:val="15"/>
               </w:rPr>
-              <w:t>3</w:t>
+              <w:t>3.1</w:t>
             </w:r>
           </w:p>
         </w:tc>
@@ -794,7 +787,7 @@
               <w:rPr>
                 <w:sz w:val="15"/>
               </w:rPr>
-              <w:t>4</w:t>
+              <w:t>3.2</w:t>
             </w:r>
           </w:p>
         </w:tc>
@@ -838,7 +831,7 @@
               <w:rPr>
                 <w:sz w:val="15"/>
               </w:rPr>
-              <w:t>5</w:t>
+              <w:t>3.3</w:t>
             </w:r>
           </w:p>
         </w:tc>
@@ -882,7 +875,7 @@
               <w:rPr>
                 <w:sz w:val="15"/>
               </w:rPr>
-              <w:t>6</w:t>
+              <w:t>3.4</w:t>
             </w:r>
           </w:p>
         </w:tc>
@@ -926,7 +919,51 @@
               <w:rPr>
                 <w:sz w:val="15"/>
               </w:rPr>
-              <w:t>7</w:t>
+              <w:t>3.5</w:t>
+            </w:r>
+          </w:p>
+        </w:tc>
+        <w:tc>
+          <w:tcPr>
+            <w:tcW w:type="dxa" w:w="4797"/>
+          </w:tcPr>
+          <w:p>
+            <w:r/>
+            <w:r>
+              <w:rPr>
+                <w:sz w:val="15"/>
+              </w:rPr>
+              <w:t>Control</w:t>
+            </w:r>
+          </w:p>
+        </w:tc>
+        <w:tc>
+          <w:tcPr>
+            <w:tcW w:type="dxa" w:w="4797"/>
+          </w:tcPr>
+          <w:p>
+            <w:r/>
+            <w:r>
+              <w:rPr>
+                <w:sz w:val="15"/>
+              </w:rPr>
+              <w:t>supervise, stop, and what STOP must never touch</w:t>
+            </w:r>
+          </w:p>
+        </w:tc>
+      </w:tr>
+      <w:tr>
+        <w:tc>
+          <w:tcPr>
+            <w:tcW w:type="dxa" w:w="4797"/>
+          </w:tcPr>
+          <w:p>
+            <w:r/>
+            <w:r>
+              <w:rPr>
+                <w:sz w:val="15"/>
+              </w:rPr>
+              <w:t>4.1</w:t>
             </w:r>
           </w:p>
         </w:tc>
@@ -970,51 +1007,7 @@
               <w:rPr>
                 <w:sz w:val="15"/>
               </w:rPr>
-              <w:t>8</w:t>
-            </w:r>
-          </w:p>
-        </w:tc>
-        <w:tc>
-          <w:tcPr>
-            <w:tcW w:type="dxa" w:w="4797"/>
-          </w:tcPr>
-          <w:p>
-            <w:r/>
-            <w:r>
-              <w:rPr>
-                <w:sz w:val="15"/>
-              </w:rPr>
-              <w:t>Control</w:t>
-            </w:r>
-          </w:p>
-        </w:tc>
-        <w:tc>
-          <w:tcPr>
-            <w:tcW w:type="dxa" w:w="4797"/>
-          </w:tcPr>
-          <w:p>
-            <w:r/>
-            <w:r>
-              <w:rPr>
-                <w:sz w:val="15"/>
-              </w:rPr>
-              <w:t>supervise, stop, and what STOP must never touch</w:t>
-            </w:r>
-          </w:p>
-        </w:tc>
-      </w:tr>
-      <w:tr>
-        <w:tc>
-          <w:tcPr>
-            <w:tcW w:type="dxa" w:w="4797"/>
-          </w:tcPr>
-          <w:p>
-            <w:r/>
-            <w:r>
-              <w:rPr>
-                <w:sz w:val="15"/>
-              </w:rPr>
-              <w:t>9</w:t>
+              <w:t>4.2</w:t>
             </w:r>
           </w:p>
         </w:tc>
@@ -1058,7 +1051,7 @@
               <w:rPr>
                 <w:sz w:val="15"/>
               </w:rPr>
-              <w:t>10</w:t>
+              <w:t>4.3</w:t>
             </w:r>
           </w:p>
         </w:tc>
@@ -1097,14 +1090,6 @@
         <w:pageBreakBefore/>
         <w:spacing w:before="40" w:after="120"/>
       </w:pPr>
-      <w:r>
-        <w:rPr>
-          <w:b/>
-          <w:color w:val="8A94A0"/>
-          <w:sz w:val="22"/>
-        </w:rPr>
-        <w:t xml:space="preserve">01   </w:t>
-      </w:r>
       <w:r>
         <w:rPr>
           <w:b/>
@@ -1459,7 +1444,7 @@
           <w:color w:val="8A94A0"/>
           <w:sz w:val="22"/>
         </w:rPr>
-        <w:t xml:space="preserve">02   </w:t>
+        <w:t xml:space="preserve">1   </w:t>
       </w:r>
       <w:r>
         <w:rPr>
@@ -1467,7 +1452,7 @@
           <w:color w:val="1B4A6F"/>
           <w:sz w:val="38"/>
         </w:rPr>
-        <w:t>Level 1 — the context map</w:t>
+        <w:t>The context map</w:t>
       </w:r>
     </w:p>
     <w:p>
@@ -1957,7 +1942,7 @@
           <w:color w:val="8A94A0"/>
           <w:sz w:val="22"/>
         </w:rPr>
-        <w:t xml:space="preserve">03   </w:t>
+        <w:t xml:space="preserve">2   </w:t>
       </w:r>
       <w:r>
         <w:rPr>
@@ -1965,7 +1950,7 @@
           <w:color w:val="1B4A6F"/>
           <w:sz w:val="38"/>
         </w:rPr>
-        <w:t>Level 2 — the envelope, the only thing that travels</w:t>
+        <w:t>The envelope — the only thing that travels</w:t>
       </w:r>
     </w:p>
     <w:p>
@@ -2174,7 +2159,7 @@
           <w:color w:val="8A94A0"/>
           <w:sz w:val="22"/>
         </w:rPr>
-        <w:t xml:space="preserve">04   </w:t>
+        <w:t xml:space="preserve">3.1   </w:t>
       </w:r>
       <w:r>
         <w:rPr>
@@ -2182,7 +2167,7 @@
           <w:color w:val="1B4A6F"/>
           <w:sz w:val="38"/>
         </w:rPr>
-        <w:t>Level 3 — market data, the only process that talks to the exchange</w:t>
+        <w:t>Market data — the only process that talks to the exchange</w:t>
       </w:r>
     </w:p>
     <w:p>
@@ -2260,7 +2245,7 @@
           <w:color w:val="8A94A0"/>
           <w:sz w:val="16"/>
         </w:rPr>
-        <w:t>Figure 3 — Shards, one parse, in-memory state, then topics. Publishing never blocks the socket.</w:t>
+        <w:t>Figure 3.1 — Shards, one parse, in-memory state, then topics. Publishing never blocks the socket.</w:t>
       </w:r>
     </w:p>
     <w:p>
@@ -2540,7 +2525,7 @@
           <w:color w:val="8A94A0"/>
           <w:sz w:val="22"/>
         </w:rPr>
-        <w:t xml:space="preserve">05   </w:t>
+        <w:t xml:space="preserve">3.2   </w:t>
       </w:r>
       <w:r>
         <w:rPr>
@@ -2548,7 +2533,7 @@
           <w:color w:val="1B4A6F"/>
           <w:sz w:val="38"/>
         </w:rPr>
-        <w:t>Level 3 — the book, the aggregate that decides</w:t>
+        <w:t>The book — the aggregate that decides</w:t>
       </w:r>
     </w:p>
     <w:p>
@@ -2626,7 +2611,7 @@
           <w:color w:val="8A94A0"/>
           <w:sz w:val="16"/>
         </w:rPr>
-        <w:t>Figure 4 — A book is one aggregate: equity, positions, and the decisions that produced them.</w:t>
+        <w:t>Figure 3.2 — A book is one aggregate: equity, positions, and the decisions that produced them.</w:t>
       </w:r>
     </w:p>
     <w:tbl>
@@ -2757,7 +2742,7 @@
           <w:color w:val="8A94A0"/>
           <w:sz w:val="22"/>
         </w:rPr>
-        <w:t xml:space="preserve">06   </w:t>
+        <w:t xml:space="preserve">3.3   </w:t>
       </w:r>
       <w:r>
         <w:rPr>
@@ -2765,7 +2750,7 @@
           <w:color w:val="1B4A6F"/>
           <w:sz w:val="38"/>
         </w:rPr>
-        <w:t>Level 3 — the gate, what must pass before money moves</w:t>
+        <w:t>The gate — what must pass before money moves</w:t>
       </w:r>
     </w:p>
     <w:p>
@@ -2843,7 +2828,7 @@
           <w:color w:val="8A94A0"/>
           <w:sz w:val="16"/>
         </w:rPr>
-        <w:t>Figure 5 — Interceptors, then the arithmetic. Every stage appends a hop, so a refusal explains itself.</w:t>
+        <w:t>Figure 3.3 — Interceptors, then the arithmetic. Every stage appends a hop, so a refusal explains itself.</w:t>
       </w:r>
     </w:p>
     <w:p>
@@ -3109,7 +3094,7 @@
           <w:color w:val="8A94A0"/>
           <w:sz w:val="22"/>
         </w:rPr>
-        <w:t xml:space="preserve">07   </w:t>
+        <w:t xml:space="preserve">3.4   </w:t>
       </w:r>
       <w:r>
         <w:rPr>
@@ -3117,7 +3102,7 @@
           <w:color w:val="1B4A6F"/>
           <w:sz w:val="38"/>
         </w:rPr>
-        <w:t>Level 3 — the recorder, the only writer</w:t>
+        <w:t>The recorder — the only writer</w:t>
       </w:r>
     </w:p>
     <w:p>
@@ -3195,7 +3180,7 @@
           <w:color w:val="8A94A0"/>
           <w:sz w:val="16"/>
         </w:rPr>
-        <w:t>Figure 6 — One consumer per topic, hops recorded as they pass, derived references attached at the door.</w:t>
+        <w:t>Figure 3.4 — One consumer per topic, hops recorded as they pass, derived references attached at the door.</w:t>
       </w:r>
     </w:p>
     <w:tbl>
@@ -3326,7 +3311,7 @@
           <w:color w:val="8A94A0"/>
           <w:sz w:val="22"/>
         </w:rPr>
-        <w:t xml:space="preserve">08   </w:t>
+        <w:t xml:space="preserve">3.5   </w:t>
       </w:r>
       <w:r>
         <w:rPr>
@@ -3334,7 +3319,7 @@
           <w:color w:val="1B4A6F"/>
           <w:sz w:val="38"/>
         </w:rPr>
-        <w:t>Level 3 — control, what may change behaviour</w:t>
+        <w:t>Control — what may change behaviour</w:t>
       </w:r>
     </w:p>
     <w:p>
@@ -3412,7 +3397,7 @@
           <w:color w:val="8A94A0"/>
           <w:sz w:val="16"/>
         </w:rPr>
-        <w:t>Figure 8 — The supervisor, the stop flag and the heartbeat, and what STOP must never touch.</w:t>
+        <w:t>Figure 3.5 — The supervisor, the stop flag and the heartbeat, and what STOP must never touch.</w:t>
       </w:r>
     </w:p>
     <w:tbl>
@@ -3543,7 +3528,7 @@
           <w:color w:val="8A94A0"/>
           <w:sz w:val="22"/>
         </w:rPr>
-        <w:t xml:space="preserve">09   </w:t>
+        <w:t xml:space="preserve">4.1   </w:t>
       </w:r>
       <w:r>
         <w:rPr>
@@ -3551,7 +3536,7 @@
           <w:color w:val="1B4A6F"/>
           <w:sz w:val="38"/>
         </w:rPr>
-        <w:t>Level 4 — the lake, what is actually on disk</w:t>
+        <w:t>The lake — what is actually on disk</w:t>
       </w:r>
     </w:p>
     <w:p>
@@ -3629,7 +3614,7 @@
           <w:color w:val="8A94A0"/>
           <w:sz w:val="16"/>
         </w:rPr>
-        <w:t>Figure 7 — A journal, a line format, an index, and the retention that keeps it from growing forever.</w:t>
+        <w:t>Figure 4.1 — A journal, a line format, an index, and the retention that keeps it from growing forever.</w:t>
       </w:r>
     </w:p>
     <w:p>
@@ -3909,7 +3894,7 @@
           <w:color w:val="8A94A0"/>
           <w:sz w:val="22"/>
         </w:rPr>
-        <w:t xml:space="preserve">10   </w:t>
+        <w:t xml:space="preserve">4.2   </w:t>
       </w:r>
       <w:r>
         <w:rPr>
@@ -3917,7 +3902,7 @@
           <w:color w:val="1B4A6F"/>
           <w:sz w:val="38"/>
         </w:rPr>
-        <w:t>Level 4 — the data stores, as they exist</w:t>
+        <w:t>The data stores, as they exist</w:t>
       </w:r>
     </w:p>
     <w:p>
@@ -3995,7 +3980,7 @@
           <w:color w:val="8A94A0"/>
           <w:sz w:val="16"/>
         </w:rPr>
-        <w:t>Figure 9 — Eight stores. The journal is the only one that is a record; the rest are derived, cached, archived or diagnostic.</w:t>
+        <w:t>Figure 4.2 — Eight stores. The journal is the only one that is a record; the rest are derived, cached, archived or diagnostic.</w:t>
       </w:r>
     </w:p>
     <w:p>
@@ -4581,7 +4566,7 @@
           <w:color w:val="8A94A0"/>
           <w:sz w:val="22"/>
         </w:rPr>
-        <w:t xml:space="preserve">11   </w:t>
+        <w:t xml:space="preserve">4.3   </w:t>
       </w:r>
       <w:r>
         <w:rPr>
@@ -4589,7 +4574,7 @@
           <w:color w:val="1B4A6F"/>
           <w:sz w:val="38"/>
         </w:rPr>
-        <w:t>Level 4 — how the lake chooses</w:t>
+        <w:t>How the lake chooses</w:t>
       </w:r>
     </w:p>
     <w:p>
@@ -4667,7 +4652,7 @@
           <w:color w:val="8A94A0"/>
           <w:sz w:val="16"/>
         </w:rPr>
-        <w:t>Figure 10 — One question per level: what is it, how long does it live, is it big enough to seal. Nothing is deleted by a rule that is not drawn here.</w:t>
+        <w:t>Figure 4.3 — One question per level: what is it, how long does it live, is it big enough to seal. Nothing is deleted by a rule that is not drawn here.</w:t>
       </w:r>
     </w:p>
     <w:tbl>
@@ -4798,7 +4783,7 @@
           <w:color w:val="8A94A0"/>
           <w:sz w:val="22"/>
         </w:rPr>
-        <w:t xml:space="preserve">12   </w:t>
+        <w:t xml:space="preserve">5   </w:t>
       </w:r>
       <w:r>
         <w:rPr>
@@ -4806,7 +4791,7 @@
           <w:color w:val="1B4A6F"/>
           <w:sz w:val="38"/>
         </w:rPr>
-        <w:t>Level 5 — beneath the lake</w:t>
+        <w:t>Beneath the lake</w:t>
       </w:r>
     </w:p>
     <w:p>
@@ -5090,14 +5075,6 @@
         <w:pageBreakBefore/>
         <w:spacing w:before="40" w:after="120"/>
       </w:pPr>
-      <w:r>
-        <w:rPr>
-          <w:b/>
-          <w:color w:val="8A94A0"/>
-          <w:sz w:val="22"/>
-        </w:rPr>
-        <w:t xml:space="preserve">13   </w:t>
-      </w:r>
       <w:r>
         <w:rPr>
           <w:b/>
@@ -5446,14 +5423,6 @@
         <w:pageBreakBefore/>
         <w:spacing w:before="40" w:after="120"/>
       </w:pPr>
-      <w:r>
-        <w:rPr>
-          <w:b/>
-          <w:color w:val="8A94A0"/>
-          <w:sz w:val="22"/>
-        </w:rPr>
-        <w:t xml:space="preserve">14   </w:t>
-      </w:r>
       <w:r>
         <w:rPr>
           <w:b/>

</xml_diff>